<commit_message>
dbms 6th assig completed
</commit_message>
<xml_diff>
--- a/DBMS/module 1/assignment  6.docx
+++ b/DBMS/module 1/assignment  6.docx
@@ -1168,7 +1168,7 @@
           <w:tab w:val="left" w:pos="523"/>
         </w:tabs>
         <w:spacing w:before="183" w:after="0" w:line="240" w:lineRule="auto"/>
-        <w:ind w:left="523" w:right="0" w:hanging="358"/>
+        <w:ind w:left="358" w:leftChars="0" w:right="0" w:hanging="358" w:firstLineChars="0"/>
         <w:jc w:val="left"/>
         <w:rPr>
           <w:sz w:val="22"/>
@@ -1442,7 +1442,7 @@
           <w:tab w:val="left" w:pos="523"/>
         </w:tabs>
         <w:spacing w:before="19" w:after="0" w:line="240" w:lineRule="auto"/>
-        <w:ind w:left="523" w:right="0" w:hanging="358"/>
+        <w:ind w:left="358" w:leftChars="0" w:right="0" w:hanging="358" w:firstLineChars="0"/>
         <w:jc w:val="left"/>
         <w:rPr>
           <w:sz w:val="22"/>
@@ -1682,7 +1682,7 @@
           <w:tab w:val="left" w:pos="523"/>
         </w:tabs>
         <w:spacing w:before="22" w:after="0" w:line="240" w:lineRule="auto"/>
-        <w:ind w:left="523" w:right="0" w:hanging="358"/>
+        <w:ind w:left="358" w:leftChars="0" w:right="0" w:hanging="358" w:firstLineChars="0"/>
         <w:jc w:val="left"/>
         <w:rPr>
           <w:sz w:val="22"/>
@@ -1901,7 +1901,7 @@
           <w:tab w:val="left" w:pos="523"/>
         </w:tabs>
         <w:spacing w:before="22" w:after="0" w:line="240" w:lineRule="auto"/>
-        <w:ind w:left="523" w:right="0" w:hanging="358"/>
+        <w:ind w:left="358" w:leftChars="0" w:right="0" w:hanging="358" w:firstLineChars="0"/>
         <w:jc w:val="left"/>
         <w:rPr>
           <w:sz w:val="22"/>
@@ -2177,7 +2177,7 @@
           <w:tab w:val="left" w:pos="523"/>
         </w:tabs>
         <w:spacing w:before="22" w:after="0" w:line="240" w:lineRule="auto"/>
-        <w:ind w:left="523" w:right="0" w:hanging="358"/>
+        <w:ind w:left="358" w:leftChars="0" w:right="0" w:hanging="358" w:firstLineChars="0"/>
         <w:jc w:val="left"/>
         <w:rPr>
           <w:sz w:val="22"/>
@@ -2358,7 +2358,7 @@
           <w:tab w:val="left" w:pos="523"/>
         </w:tabs>
         <w:spacing w:before="19" w:after="0" w:line="240" w:lineRule="auto"/>
-        <w:ind w:left="523" w:right="0" w:hanging="358"/>
+        <w:ind w:left="358" w:leftChars="0" w:right="0" w:hanging="358" w:firstLineChars="0"/>
         <w:jc w:val="left"/>
         <w:rPr>
           <w:sz w:val="22"/>
@@ -2572,7 +2572,7 @@
           <w:tab w:val="left" w:pos="523"/>
         </w:tabs>
         <w:spacing w:before="22" w:after="0" w:line="240" w:lineRule="auto"/>
-        <w:ind w:left="523" w:right="0" w:hanging="358"/>
+        <w:ind w:left="358" w:leftChars="0" w:right="0" w:hanging="358" w:firstLineChars="0"/>
         <w:jc w:val="left"/>
         <w:rPr>
           <w:sz w:val="22"/>
@@ -2808,7 +2808,7 @@
           <w:tab w:val="left" w:pos="523"/>
         </w:tabs>
         <w:spacing w:before="22" w:after="0" w:line="240" w:lineRule="auto"/>
-        <w:ind w:left="523" w:right="0" w:hanging="358"/>
+        <w:ind w:left="358" w:leftChars="0" w:right="0" w:hanging="358" w:firstLineChars="0"/>
         <w:jc w:val="left"/>
         <w:rPr>
           <w:sz w:val="22"/>
@@ -3070,7 +3070,7 @@
           <w:tab w:val="left" w:pos="523"/>
         </w:tabs>
         <w:spacing w:before="22" w:after="0" w:line="240" w:lineRule="auto"/>
-        <w:ind w:left="523" w:right="0" w:hanging="358"/>
+        <w:ind w:left="358" w:leftChars="0" w:right="0" w:hanging="358" w:firstLineChars="0"/>
         <w:jc w:val="left"/>
         <w:rPr>
           <w:sz w:val="22"/>
@@ -3406,7 +3406,7 @@
           <w:tab w:val="left" w:pos="523"/>
         </w:tabs>
         <w:spacing w:before="19" w:after="0" w:line="240" w:lineRule="auto"/>
-        <w:ind w:left="523" w:right="0" w:hanging="358"/>
+        <w:ind w:left="358" w:leftChars="0" w:right="0" w:hanging="358" w:firstLineChars="0"/>
         <w:jc w:val="left"/>
         <w:rPr>
           <w:sz w:val="22"/>
@@ -3782,7 +3782,7 @@
           <w:tab w:val="left" w:pos="523"/>
         </w:tabs>
         <w:spacing w:before="22" w:after="0" w:line="240" w:lineRule="auto"/>
-        <w:ind w:left="523" w:right="0" w:hanging="358"/>
+        <w:ind w:left="358" w:leftChars="0" w:right="0" w:hanging="358" w:firstLineChars="0"/>
         <w:jc w:val="left"/>
         <w:rPr>
           <w:sz w:val="22"/>
@@ -4174,2657 +4174,1091 @@
     </w:p>
     <w:p>
       <w:pPr>
-        <w:pStyle w:val="6"/>
-        <w:numPr>
-          <w:ilvl w:val="0"/>
-          <w:numId w:val="2"/>
-        </w:numPr>
-        <w:tabs>
-          <w:tab w:val="left" w:pos="523"/>
-        </w:tabs>
-        <w:spacing w:before="180" w:after="0" w:line="240" w:lineRule="auto"/>
-        <w:ind w:left="523" w:right="0" w:hanging="358"/>
-        <w:jc w:val="left"/>
-        <w:rPr>
-          <w:sz w:val="22"/>
-        </w:rPr>
-      </w:pPr>
-      <w:r>
-        <w:rPr>
-          <w:sz w:val="22"/>
-        </w:rPr>
-        <w:t>find</w:t>
-      </w:r>
-      <w:r>
-        <w:rPr>
-          <w:spacing w:val="-3"/>
-          <w:sz w:val="22"/>
-        </w:rPr>
-        <w:t xml:space="preserve"> </w:t>
-      </w:r>
-      <w:r>
-        <w:rPr>
-          <w:sz w:val="22"/>
-        </w:rPr>
-        <w:t>max</w:t>
-      </w:r>
-      <w:r>
-        <w:rPr>
-          <w:spacing w:val="-3"/>
-          <w:sz w:val="22"/>
-        </w:rPr>
-        <w:t xml:space="preserve"> </w:t>
-      </w:r>
-      <w:r>
-        <w:rPr>
-          <w:sz w:val="22"/>
-        </w:rPr>
-        <w:t>sal</w:t>
-      </w:r>
-      <w:r>
-        <w:rPr>
-          <w:spacing w:val="-2"/>
-          <w:sz w:val="22"/>
-        </w:rPr>
-        <w:t xml:space="preserve"> </w:t>
-      </w:r>
-      <w:r>
-        <w:rPr>
-          <w:sz w:val="22"/>
-        </w:rPr>
-        <w:t>and</w:t>
-      </w:r>
-      <w:r>
-        <w:rPr>
-          <w:spacing w:val="-4"/>
-          <w:sz w:val="22"/>
-        </w:rPr>
-        <w:t xml:space="preserve"> </w:t>
-      </w:r>
-      <w:r>
-        <w:rPr>
-          <w:sz w:val="22"/>
-        </w:rPr>
-        <w:t>min</w:t>
-      </w:r>
-      <w:r>
-        <w:rPr>
-          <w:spacing w:val="-3"/>
-          <w:sz w:val="22"/>
-        </w:rPr>
-        <w:t xml:space="preserve"> </w:t>
-      </w:r>
-      <w:r>
-        <w:rPr>
-          <w:sz w:val="22"/>
-        </w:rPr>
-        <w:t>sal</w:t>
-      </w:r>
-      <w:r>
-        <w:rPr>
-          <w:spacing w:val="-2"/>
-          <w:sz w:val="22"/>
-        </w:rPr>
-        <w:t xml:space="preserve"> </w:t>
-      </w:r>
-      <w:r>
-        <w:rPr>
-          <w:sz w:val="22"/>
-        </w:rPr>
-        <w:t>for</w:t>
-      </w:r>
-      <w:r>
-        <w:rPr>
-          <w:spacing w:val="-4"/>
-          <w:sz w:val="22"/>
-        </w:rPr>
-        <w:t xml:space="preserve"> </w:t>
-      </w:r>
-      <w:r>
-        <w:rPr>
-          <w:sz w:val="22"/>
-        </w:rPr>
-        <w:t>each</w:t>
-      </w:r>
-      <w:r>
-        <w:rPr>
-          <w:spacing w:val="-2"/>
-          <w:sz w:val="22"/>
-        </w:rPr>
-        <w:t xml:space="preserve"> </w:t>
-      </w:r>
-      <w:r>
-        <w:rPr>
-          <w:spacing w:val="-5"/>
-          <w:sz w:val="22"/>
-        </w:rPr>
-        <w:t>job</w:t>
-      </w:r>
-    </w:p>
-    <w:p>
-      <w:pPr>
-        <w:pStyle w:val="6"/>
-        <w:numPr>
-          <w:ilvl w:val="0"/>
-          <w:numId w:val="2"/>
-        </w:numPr>
-        <w:tabs>
-          <w:tab w:val="left" w:pos="523"/>
-        </w:tabs>
-        <w:spacing w:before="22" w:after="0" w:line="240" w:lineRule="auto"/>
-        <w:ind w:left="523" w:right="0" w:hanging="358"/>
-        <w:jc w:val="left"/>
-        <w:rPr>
-          <w:sz w:val="22"/>
-        </w:rPr>
-      </w:pPr>
-      <w:r>
-        <w:rPr>
-          <w:sz w:val="22"/>
-        </w:rPr>
-        <w:t>find</w:t>
-      </w:r>
-      <w:r>
-        <w:rPr>
-          <w:spacing w:val="-5"/>
-          <w:sz w:val="22"/>
-        </w:rPr>
-        <w:t xml:space="preserve"> </w:t>
-      </w:r>
-      <w:r>
-        <w:rPr>
-          <w:sz w:val="22"/>
-        </w:rPr>
-        <w:t>how</w:t>
-      </w:r>
-      <w:r>
-        <w:rPr>
-          <w:spacing w:val="-6"/>
-          <w:sz w:val="22"/>
-        </w:rPr>
-        <w:t xml:space="preserve"> </w:t>
-      </w:r>
-      <w:r>
-        <w:rPr>
-          <w:sz w:val="22"/>
-        </w:rPr>
-        <w:t>many</w:t>
-      </w:r>
-      <w:r>
-        <w:rPr>
-          <w:spacing w:val="-6"/>
-          <w:sz w:val="22"/>
-        </w:rPr>
-        <w:t xml:space="preserve"> </w:t>
-      </w:r>
-      <w:r>
-        <w:rPr>
-          <w:sz w:val="22"/>
-        </w:rPr>
-        <w:t>employess</w:t>
-      </w:r>
-      <w:r>
-        <w:rPr>
-          <w:spacing w:val="-7"/>
-          <w:sz w:val="22"/>
-        </w:rPr>
-        <w:t xml:space="preserve"> </w:t>
-      </w:r>
-      <w:r>
-        <w:rPr>
-          <w:sz w:val="22"/>
-        </w:rPr>
-        <w:t>have</w:t>
-      </w:r>
-      <w:r>
-        <w:rPr>
-          <w:spacing w:val="-4"/>
-          <w:sz w:val="22"/>
-        </w:rPr>
-        <w:t xml:space="preserve"> </w:t>
-      </w:r>
-      <w:r>
-        <w:rPr>
-          <w:sz w:val="22"/>
-        </w:rPr>
-        <w:t>not</w:t>
-      </w:r>
-      <w:r>
-        <w:rPr>
-          <w:spacing w:val="-4"/>
-          <w:sz w:val="22"/>
-        </w:rPr>
-        <w:t xml:space="preserve"> </w:t>
-      </w:r>
-      <w:r>
-        <w:rPr>
-          <w:sz w:val="22"/>
-        </w:rPr>
-        <w:t>received</w:t>
-      </w:r>
-      <w:r>
-        <w:rPr>
-          <w:spacing w:val="-6"/>
-          <w:sz w:val="22"/>
-        </w:rPr>
-        <w:t xml:space="preserve"> </w:t>
-      </w:r>
-      <w:r>
-        <w:rPr>
-          <w:spacing w:val="-2"/>
-          <w:sz w:val="22"/>
+        <w:numPr>
+          <w:ilvl w:val="0"/>
+          <w:numId w:val="3"/>
+        </w:numPr>
+        <w:rPr>
+          <w:b/>
+          <w:bCs/>
+          <w:lang w:val="en-US"/>
+        </w:rPr>
+      </w:pPr>
+      <w:r>
+        <w:rPr>
+          <w:b/>
+          <w:bCs/>
+          <w:lang w:val="en-US"/>
+        </w:rPr>
+        <w:t>find max sal and min sal for each job</w:t>
+      </w:r>
+    </w:p>
+    <w:p>
+      <w:pPr>
+        <w:ind w:left="525"/>
+        <w:rPr>
+          <w:lang w:val="en-US"/>
+        </w:rPr>
+      </w:pPr>
+      <w:r>
+        <w:rPr>
+          <w:lang w:val="en-US"/>
+        </w:rPr>
+        <w:t>Select job,max(sal), min(sal)</w:t>
+      </w:r>
+    </w:p>
+    <w:p>
+      <w:pPr>
+        <w:ind w:left="525"/>
+        <w:rPr>
+          <w:lang w:val="en-US"/>
+        </w:rPr>
+      </w:pPr>
+      <w:r>
+        <w:rPr>
+          <w:lang w:val="en-US"/>
+        </w:rPr>
+        <w:t xml:space="preserve">    -&gt; from emp</w:t>
+      </w:r>
+    </w:p>
+    <w:p>
+      <w:pPr>
+        <w:ind w:left="525"/>
+        <w:rPr>
+          <w:lang w:val="en-US"/>
+        </w:rPr>
+      </w:pPr>
+      <w:r>
+        <w:rPr>
+          <w:lang w:val="en-US"/>
+        </w:rPr>
+        <w:t xml:space="preserve">    -&gt; group by job;</w:t>
+      </w:r>
+    </w:p>
+    <w:p>
+      <w:pPr>
+        <w:numPr>
+          <w:ilvl w:val="0"/>
+          <w:numId w:val="3"/>
+        </w:numPr>
+        <w:rPr>
+          <w:b/>
+          <w:bCs/>
+          <w:lang w:val="en-US"/>
+        </w:rPr>
+      </w:pPr>
+      <w:r>
+        <w:rPr>
+          <w:b/>
+          <w:bCs/>
+          <w:lang w:val="en-US"/>
+        </w:rPr>
+        <w:t>find how many employess have not received</w:t>
+      </w:r>
+      <w:r>
+        <w:rPr>
+          <w:lang w:val="en-US"/>
+        </w:rPr>
+        <w:t xml:space="preserve"> </w:t>
+      </w:r>
+      <w:r>
+        <w:rPr>
+          <w:b/>
+          <w:bCs/>
+          <w:lang w:val="en-US"/>
         </w:rPr>
         <w:t>commission</w:t>
       </w:r>
     </w:p>
     <w:p>
       <w:pPr>
-        <w:pStyle w:val="6"/>
-        <w:numPr>
-          <w:ilvl w:val="0"/>
-          <w:numId w:val="2"/>
-        </w:numPr>
-        <w:tabs>
-          <w:tab w:val="left" w:pos="523"/>
-        </w:tabs>
-        <w:spacing w:before="22" w:after="0" w:line="240" w:lineRule="auto"/>
-        <w:ind w:left="523" w:right="0" w:hanging="358"/>
-        <w:jc w:val="left"/>
-        <w:rPr>
-          <w:sz w:val="22"/>
-        </w:rPr>
-      </w:pPr>
-      <w:r>
-        <w:rPr>
-          <w:sz w:val="22"/>
-        </w:rPr>
-        <w:t>find</w:t>
-      </w:r>
-      <w:r>
-        <w:rPr>
-          <w:spacing w:val="-5"/>
-          <w:sz w:val="22"/>
-        </w:rPr>
-        <w:t xml:space="preserve"> </w:t>
-      </w:r>
-      <w:r>
-        <w:rPr>
-          <w:sz w:val="22"/>
-        </w:rPr>
-        <w:t>sum</w:t>
-      </w:r>
-      <w:r>
-        <w:rPr>
-          <w:spacing w:val="-3"/>
-          <w:sz w:val="22"/>
-        </w:rPr>
-        <w:t xml:space="preserve"> </w:t>
-      </w:r>
-      <w:r>
-        <w:rPr>
-          <w:sz w:val="22"/>
-        </w:rPr>
-        <w:t>of</w:t>
-      </w:r>
-      <w:r>
-        <w:rPr>
-          <w:spacing w:val="-2"/>
-          <w:sz w:val="22"/>
-        </w:rPr>
-        <w:t xml:space="preserve"> </w:t>
-      </w:r>
-      <w:r>
-        <w:rPr>
-          <w:sz w:val="22"/>
-        </w:rPr>
-        <w:t>sal</w:t>
-      </w:r>
-      <w:r>
-        <w:rPr>
-          <w:spacing w:val="-4"/>
-          <w:sz w:val="22"/>
-        </w:rPr>
-        <w:t xml:space="preserve"> </w:t>
-      </w:r>
-      <w:r>
-        <w:rPr>
-          <w:sz w:val="22"/>
-        </w:rPr>
-        <w:t>of</w:t>
-      </w:r>
-      <w:r>
-        <w:rPr>
-          <w:spacing w:val="-2"/>
-          <w:sz w:val="22"/>
-        </w:rPr>
-        <w:t xml:space="preserve"> </w:t>
-      </w:r>
-      <w:r>
-        <w:rPr>
-          <w:sz w:val="22"/>
-        </w:rPr>
-        <w:t>all</w:t>
-      </w:r>
-      <w:r>
-        <w:rPr>
-          <w:spacing w:val="-5"/>
-          <w:sz w:val="22"/>
-        </w:rPr>
-        <w:t xml:space="preserve"> </w:t>
-      </w:r>
-      <w:r>
-        <w:rPr>
-          <w:sz w:val="22"/>
-        </w:rPr>
-        <w:t>employees</w:t>
-      </w:r>
-      <w:r>
-        <w:rPr>
-          <w:spacing w:val="-5"/>
-          <w:sz w:val="22"/>
-        </w:rPr>
-        <w:t xml:space="preserve"> </w:t>
-      </w:r>
-      <w:r>
-        <w:rPr>
-          <w:sz w:val="22"/>
-        </w:rPr>
-        <w:t>working</w:t>
-      </w:r>
-      <w:r>
-        <w:rPr>
-          <w:spacing w:val="-3"/>
-          <w:sz w:val="22"/>
-        </w:rPr>
-        <w:t xml:space="preserve"> </w:t>
-      </w:r>
-      <w:r>
-        <w:rPr>
-          <w:sz w:val="22"/>
-        </w:rPr>
-        <w:t>in</w:t>
-      </w:r>
-      <w:r>
-        <w:rPr>
-          <w:spacing w:val="-2"/>
-          <w:sz w:val="22"/>
-        </w:rPr>
-        <w:t xml:space="preserve"> </w:t>
-      </w:r>
-      <w:r>
-        <w:rPr>
-          <w:sz w:val="22"/>
-        </w:rPr>
-        <w:t>dept</w:t>
-      </w:r>
-      <w:r>
-        <w:rPr>
-          <w:spacing w:val="-2"/>
-          <w:sz w:val="22"/>
-        </w:rPr>
-        <w:t xml:space="preserve"> </w:t>
-      </w:r>
-      <w:r>
-        <w:rPr>
-          <w:sz w:val="22"/>
-        </w:rPr>
-        <w:t>no</w:t>
-      </w:r>
-      <w:r>
-        <w:rPr>
-          <w:spacing w:val="-3"/>
-          <w:sz w:val="22"/>
-        </w:rPr>
-        <w:t xml:space="preserve"> </w:t>
-      </w:r>
-      <w:r>
-        <w:rPr>
-          <w:spacing w:val="-5"/>
-          <w:sz w:val="22"/>
-        </w:rPr>
-        <w:t>10</w:t>
-      </w:r>
-    </w:p>
-    <w:p>
-      <w:pPr>
-        <w:pStyle w:val="6"/>
-        <w:numPr>
-          <w:ilvl w:val="0"/>
-          <w:numId w:val="2"/>
-        </w:numPr>
-        <w:tabs>
-          <w:tab w:val="left" w:pos="523"/>
-        </w:tabs>
-        <w:spacing w:before="19" w:after="0" w:line="240" w:lineRule="auto"/>
-        <w:ind w:left="523" w:right="0" w:hanging="358"/>
-        <w:jc w:val="left"/>
-        <w:rPr>
-          <w:sz w:val="22"/>
-        </w:rPr>
-      </w:pPr>
-      <w:r>
-        <w:rPr>
-          <w:sz w:val="22"/>
-        </w:rPr>
-        <w:t>find</w:t>
-      </w:r>
-      <w:r>
-        <w:rPr>
-          <w:spacing w:val="-7"/>
-          <w:sz w:val="22"/>
-        </w:rPr>
-        <w:t xml:space="preserve"> </w:t>
-      </w:r>
-      <w:r>
-        <w:rPr>
-          <w:sz w:val="22"/>
-        </w:rPr>
-        <w:t>maximum</w:t>
-      </w:r>
-      <w:r>
-        <w:rPr>
-          <w:spacing w:val="-4"/>
-          <w:sz w:val="22"/>
-        </w:rPr>
-        <w:t xml:space="preserve"> </w:t>
-      </w:r>
-      <w:r>
-        <w:rPr>
-          <w:sz w:val="22"/>
-        </w:rPr>
-        <w:t>salary,average</w:t>
-      </w:r>
-      <w:r>
-        <w:rPr>
-          <w:spacing w:val="-4"/>
-          <w:sz w:val="22"/>
-        </w:rPr>
-        <w:t xml:space="preserve"> </w:t>
-      </w:r>
-      <w:r>
-        <w:rPr>
-          <w:sz w:val="22"/>
-        </w:rPr>
-        <w:t>sal</w:t>
-      </w:r>
-      <w:r>
-        <w:rPr>
-          <w:spacing w:val="-3"/>
-          <w:sz w:val="22"/>
-        </w:rPr>
-        <w:t xml:space="preserve"> </w:t>
-      </w:r>
-      <w:r>
-        <w:rPr>
-          <w:sz w:val="22"/>
-        </w:rPr>
-        <w:t>for</w:t>
-      </w:r>
-      <w:r>
-        <w:rPr>
-          <w:spacing w:val="-4"/>
-          <w:sz w:val="22"/>
-        </w:rPr>
-        <w:t xml:space="preserve"> </w:t>
-      </w:r>
-      <w:r>
-        <w:rPr>
-          <w:sz w:val="22"/>
-        </w:rPr>
-        <w:t>each</w:t>
-      </w:r>
-      <w:r>
-        <w:rPr>
-          <w:spacing w:val="-3"/>
-          <w:sz w:val="22"/>
-        </w:rPr>
-        <w:t xml:space="preserve"> </w:t>
-      </w:r>
-      <w:r>
-        <w:rPr>
-          <w:sz w:val="22"/>
-        </w:rPr>
-        <w:t>job</w:t>
-      </w:r>
-      <w:r>
-        <w:rPr>
-          <w:spacing w:val="-5"/>
-          <w:sz w:val="22"/>
-        </w:rPr>
-        <w:t xml:space="preserve"> </w:t>
-      </w:r>
-      <w:r>
-        <w:rPr>
-          <w:sz w:val="22"/>
-        </w:rPr>
-        <w:t>in</w:t>
-      </w:r>
-      <w:r>
-        <w:rPr>
-          <w:spacing w:val="-3"/>
-          <w:sz w:val="22"/>
-        </w:rPr>
-        <w:t xml:space="preserve"> </w:t>
-      </w:r>
-      <w:r>
-        <w:rPr>
-          <w:sz w:val="22"/>
-        </w:rPr>
-        <w:t>every</w:t>
-      </w:r>
-      <w:r>
-        <w:rPr>
-          <w:spacing w:val="-5"/>
-          <w:sz w:val="22"/>
-        </w:rPr>
-        <w:t xml:space="preserve"> </w:t>
-      </w:r>
-      <w:r>
-        <w:rPr>
-          <w:spacing w:val="-2"/>
-          <w:sz w:val="22"/>
-        </w:rPr>
-        <w:t>department</w:t>
-      </w:r>
-    </w:p>
-    <w:p>
-      <w:pPr>
-        <w:pStyle w:val="6"/>
-        <w:numPr>
-          <w:ilvl w:val="0"/>
-          <w:numId w:val="2"/>
-        </w:numPr>
-        <w:tabs>
-          <w:tab w:val="left" w:pos="523"/>
-        </w:tabs>
-        <w:spacing w:before="22" w:after="0" w:line="240" w:lineRule="auto"/>
-        <w:ind w:left="523" w:right="0" w:hanging="358"/>
-        <w:jc w:val="left"/>
-        <w:rPr>
-          <w:sz w:val="22"/>
-        </w:rPr>
-      </w:pPr>
-      <w:r>
-        <w:rPr>
-          <w:sz w:val="22"/>
-        </w:rPr>
-        <w:t>find</w:t>
-      </w:r>
-      <w:r>
-        <w:rPr>
-          <w:spacing w:val="-6"/>
-          <w:sz w:val="22"/>
-        </w:rPr>
-        <w:t xml:space="preserve"> </w:t>
-      </w:r>
-      <w:r>
-        <w:rPr>
-          <w:sz w:val="22"/>
-        </w:rPr>
-        <w:t>max</w:t>
-      </w:r>
-      <w:r>
-        <w:rPr>
-          <w:spacing w:val="-5"/>
-          <w:sz w:val="22"/>
-        </w:rPr>
-        <w:t xml:space="preserve"> </w:t>
-      </w:r>
-      <w:r>
-        <w:rPr>
-          <w:sz w:val="22"/>
-        </w:rPr>
-        <w:t>salary</w:t>
-      </w:r>
-      <w:r>
-        <w:rPr>
-          <w:spacing w:val="-2"/>
-          <w:sz w:val="22"/>
-        </w:rPr>
-        <w:t xml:space="preserve"> </w:t>
-      </w:r>
-      <w:r>
-        <w:rPr>
-          <w:sz w:val="22"/>
-        </w:rPr>
-        <w:t>for</w:t>
-      </w:r>
-      <w:r>
-        <w:rPr>
-          <w:spacing w:val="-5"/>
-          <w:sz w:val="22"/>
-        </w:rPr>
-        <w:t xml:space="preserve"> </w:t>
-      </w:r>
-      <w:r>
-        <w:rPr>
-          <w:sz w:val="22"/>
-        </w:rPr>
-        <w:t>every</w:t>
-      </w:r>
-      <w:r>
-        <w:rPr>
-          <w:spacing w:val="-4"/>
-          <w:sz w:val="22"/>
-        </w:rPr>
-        <w:t xml:space="preserve"> </w:t>
-      </w:r>
-      <w:r>
-        <w:rPr>
-          <w:sz w:val="22"/>
-        </w:rPr>
-        <w:t>department</w:t>
-      </w:r>
-      <w:r>
-        <w:rPr>
-          <w:spacing w:val="-3"/>
-          <w:sz w:val="22"/>
-        </w:rPr>
-        <w:t xml:space="preserve"> </w:t>
-      </w:r>
-      <w:r>
-        <w:rPr>
-          <w:sz w:val="22"/>
-        </w:rPr>
-        <w:t>if</w:t>
-      </w:r>
-      <w:r>
-        <w:rPr>
-          <w:spacing w:val="-2"/>
-          <w:sz w:val="22"/>
-        </w:rPr>
-        <w:t xml:space="preserve"> </w:t>
-      </w:r>
-      <w:r>
-        <w:rPr>
-          <w:sz w:val="22"/>
-        </w:rPr>
-        <w:t>deptno</w:t>
-      </w:r>
-      <w:r>
-        <w:rPr>
-          <w:spacing w:val="-5"/>
-          <w:sz w:val="22"/>
-        </w:rPr>
-        <w:t xml:space="preserve"> </w:t>
-      </w:r>
-      <w:r>
-        <w:rPr>
-          <w:sz w:val="22"/>
-        </w:rPr>
-        <w:t>is</w:t>
-      </w:r>
-      <w:r>
-        <w:rPr>
-          <w:spacing w:val="-3"/>
-          <w:sz w:val="22"/>
-        </w:rPr>
-        <w:t xml:space="preserve"> </w:t>
-      </w:r>
-      <w:r>
-        <w:rPr>
-          <w:sz w:val="22"/>
-        </w:rPr>
-        <w:t>&gt;</w:t>
-      </w:r>
-      <w:r>
-        <w:rPr>
-          <w:spacing w:val="-4"/>
-          <w:sz w:val="22"/>
-        </w:rPr>
-        <w:t xml:space="preserve"> </w:t>
-      </w:r>
-      <w:r>
-        <w:rPr>
-          <w:sz w:val="22"/>
-        </w:rPr>
-        <w:t>15</w:t>
-      </w:r>
-      <w:r>
-        <w:rPr>
-          <w:spacing w:val="-5"/>
-          <w:sz w:val="22"/>
-        </w:rPr>
-        <w:t xml:space="preserve"> </w:t>
-      </w:r>
-      <w:r>
-        <w:rPr>
-          <w:sz w:val="22"/>
-        </w:rPr>
-        <w:t>and</w:t>
-      </w:r>
-      <w:r>
-        <w:rPr>
-          <w:spacing w:val="-4"/>
-          <w:sz w:val="22"/>
-        </w:rPr>
-        <w:t xml:space="preserve"> </w:t>
-      </w:r>
-      <w:r>
-        <w:rPr>
-          <w:sz w:val="22"/>
-        </w:rPr>
-        <w:t>arrange</w:t>
-      </w:r>
-      <w:r>
-        <w:rPr>
-          <w:spacing w:val="-3"/>
-          <w:sz w:val="22"/>
-        </w:rPr>
-        <w:t xml:space="preserve"> </w:t>
-      </w:r>
-      <w:r>
-        <w:rPr>
-          <w:sz w:val="22"/>
-        </w:rPr>
-        <w:t>data</w:t>
-      </w:r>
-      <w:r>
-        <w:rPr>
-          <w:spacing w:val="-2"/>
-          <w:sz w:val="22"/>
-        </w:rPr>
-        <w:t xml:space="preserve"> </w:t>
-      </w:r>
-      <w:r>
-        <w:rPr>
-          <w:sz w:val="22"/>
-        </w:rPr>
-        <w:t>in</w:t>
-      </w:r>
-      <w:r>
-        <w:rPr>
-          <w:spacing w:val="-6"/>
-          <w:sz w:val="22"/>
-        </w:rPr>
-        <w:t xml:space="preserve"> </w:t>
-      </w:r>
-      <w:r>
-        <w:rPr>
-          <w:sz w:val="22"/>
-        </w:rPr>
-        <w:t>deptno</w:t>
-      </w:r>
-      <w:r>
-        <w:rPr>
-          <w:spacing w:val="-3"/>
-          <w:sz w:val="22"/>
-        </w:rPr>
-        <w:t xml:space="preserve"> </w:t>
-      </w:r>
-      <w:r>
-        <w:rPr>
-          <w:spacing w:val="-2"/>
-          <w:sz w:val="22"/>
-        </w:rPr>
-        <w:t>order.</w:t>
-      </w:r>
-    </w:p>
-    <w:p>
-      <w:pPr>
-        <w:pStyle w:val="6"/>
-        <w:numPr>
-          <w:ilvl w:val="0"/>
-          <w:numId w:val="2"/>
-        </w:numPr>
-        <w:tabs>
-          <w:tab w:val="left" w:pos="523"/>
-        </w:tabs>
-        <w:spacing w:before="22" w:after="0" w:line="240" w:lineRule="auto"/>
-        <w:ind w:left="523" w:right="0" w:hanging="358"/>
-        <w:jc w:val="left"/>
-        <w:rPr>
-          <w:sz w:val="22"/>
-        </w:rPr>
-      </w:pPr>
-      <w:r>
-        <w:rPr>
-          <w:sz w:val="22"/>
-        </w:rPr>
-        <w:t>find</w:t>
-      </w:r>
-      <w:r>
-        <w:rPr>
-          <w:spacing w:val="-4"/>
-          <w:sz w:val="22"/>
-        </w:rPr>
-        <w:t xml:space="preserve"> </w:t>
-      </w:r>
-      <w:r>
-        <w:rPr>
-          <w:sz w:val="22"/>
-        </w:rPr>
-        <w:t>sum</w:t>
-      </w:r>
-      <w:r>
-        <w:rPr>
-          <w:spacing w:val="-1"/>
-          <w:sz w:val="22"/>
-        </w:rPr>
-        <w:t xml:space="preserve"> </w:t>
-      </w:r>
-      <w:r>
-        <w:rPr>
-          <w:sz w:val="22"/>
-        </w:rPr>
-        <w:t>salary</w:t>
-      </w:r>
-      <w:r>
-        <w:rPr>
-          <w:spacing w:val="-2"/>
-          <w:sz w:val="22"/>
-        </w:rPr>
-        <w:t xml:space="preserve"> </w:t>
-      </w:r>
-      <w:r>
-        <w:rPr>
-          <w:sz w:val="22"/>
-        </w:rPr>
-        <w:t>for</w:t>
-      </w:r>
-      <w:r>
-        <w:rPr>
-          <w:spacing w:val="-3"/>
-          <w:sz w:val="22"/>
-        </w:rPr>
-        <w:t xml:space="preserve"> </w:t>
-      </w:r>
-      <w:r>
-        <w:rPr>
-          <w:sz w:val="22"/>
-        </w:rPr>
-        <w:t>every</w:t>
-      </w:r>
-      <w:r>
-        <w:rPr>
-          <w:spacing w:val="-2"/>
-          <w:sz w:val="22"/>
-        </w:rPr>
-        <w:t xml:space="preserve"> </w:t>
-      </w:r>
-      <w:r>
-        <w:rPr>
-          <w:sz w:val="22"/>
-        </w:rPr>
-        <w:t>department</w:t>
-      </w:r>
-      <w:r>
-        <w:rPr>
-          <w:spacing w:val="-2"/>
-          <w:sz w:val="22"/>
-        </w:rPr>
-        <w:t xml:space="preserve"> </w:t>
-      </w:r>
-      <w:r>
-        <w:rPr>
-          <w:sz w:val="22"/>
-        </w:rPr>
-        <w:t>if</w:t>
-      </w:r>
-      <w:r>
-        <w:rPr>
-          <w:spacing w:val="-5"/>
-          <w:sz w:val="22"/>
-        </w:rPr>
-        <w:t xml:space="preserve"> </w:t>
-      </w:r>
-      <w:r>
-        <w:rPr>
-          <w:sz w:val="22"/>
-        </w:rPr>
-        <w:t>sum</w:t>
-      </w:r>
-      <w:r>
-        <w:rPr>
-          <w:spacing w:val="-1"/>
-          <w:sz w:val="22"/>
-        </w:rPr>
-        <w:t xml:space="preserve"> </w:t>
-      </w:r>
-      <w:r>
-        <w:rPr>
-          <w:sz w:val="22"/>
-        </w:rPr>
-        <w:t>is</w:t>
-      </w:r>
-      <w:r>
-        <w:rPr>
-          <w:spacing w:val="-2"/>
-          <w:sz w:val="22"/>
-        </w:rPr>
-        <w:t xml:space="preserve"> </w:t>
-      </w:r>
-      <w:r>
-        <w:rPr>
-          <w:sz w:val="22"/>
-        </w:rPr>
-        <w:t>&gt;</w:t>
-      </w:r>
-      <w:r>
-        <w:rPr>
-          <w:spacing w:val="-3"/>
-          <w:sz w:val="22"/>
-        </w:rPr>
-        <w:t xml:space="preserve"> </w:t>
-      </w:r>
-      <w:r>
-        <w:rPr>
-          <w:spacing w:val="-4"/>
-          <w:sz w:val="22"/>
-        </w:rPr>
-        <w:t>3000</w:t>
-      </w:r>
-    </w:p>
-    <w:p>
-      <w:pPr>
-        <w:pStyle w:val="6"/>
-        <w:numPr>
-          <w:ilvl w:val="0"/>
-          <w:numId w:val="2"/>
-        </w:numPr>
-        <w:tabs>
-          <w:tab w:val="left" w:pos="523"/>
-        </w:tabs>
-        <w:spacing w:before="22" w:after="0" w:line="240" w:lineRule="auto"/>
-        <w:ind w:left="523" w:right="0" w:hanging="358"/>
-        <w:jc w:val="left"/>
-        <w:rPr>
-          <w:sz w:val="22"/>
-        </w:rPr>
-      </w:pPr>
-      <w:r>
-        <w:rPr>
-          <w:sz w:val="22"/>
-        </w:rPr>
-        <w:t>list</w:t>
-      </w:r>
-      <w:r>
-        <w:rPr>
-          <w:spacing w:val="-2"/>
-          <w:sz w:val="22"/>
-        </w:rPr>
-        <w:t xml:space="preserve"> </w:t>
-      </w:r>
-      <w:r>
-        <w:rPr>
-          <w:sz w:val="22"/>
-        </w:rPr>
-        <w:t>all</w:t>
-      </w:r>
-      <w:r>
-        <w:rPr>
-          <w:spacing w:val="-4"/>
-          <w:sz w:val="22"/>
-        </w:rPr>
-        <w:t xml:space="preserve"> </w:t>
-      </w:r>
-      <w:r>
-        <w:rPr>
-          <w:sz w:val="22"/>
-        </w:rPr>
-        <w:t>department</w:t>
-      </w:r>
-      <w:r>
-        <w:rPr>
-          <w:spacing w:val="-2"/>
-          <w:sz w:val="22"/>
-        </w:rPr>
-        <w:t xml:space="preserve"> </w:t>
-      </w:r>
-      <w:r>
-        <w:rPr>
-          <w:sz w:val="22"/>
-        </w:rPr>
-        <w:t>which</w:t>
-      </w:r>
-      <w:r>
-        <w:rPr>
-          <w:spacing w:val="-7"/>
-          <w:sz w:val="22"/>
-        </w:rPr>
-        <w:t xml:space="preserve"> </w:t>
-      </w:r>
-      <w:r>
-        <w:rPr>
-          <w:sz w:val="22"/>
-        </w:rPr>
-        <w:t>has</w:t>
-      </w:r>
-      <w:r>
-        <w:rPr>
-          <w:spacing w:val="-2"/>
-          <w:sz w:val="22"/>
-        </w:rPr>
-        <w:t xml:space="preserve"> </w:t>
-      </w:r>
-      <w:r>
-        <w:rPr>
-          <w:sz w:val="22"/>
-        </w:rPr>
-        <w:t>minimum</w:t>
-      </w:r>
-      <w:r>
-        <w:rPr>
-          <w:spacing w:val="-5"/>
-          <w:sz w:val="22"/>
-        </w:rPr>
-        <w:t xml:space="preserve"> </w:t>
-      </w:r>
-      <w:r>
-        <w:rPr>
-          <w:sz w:val="22"/>
-        </w:rPr>
-        <w:t>5</w:t>
-      </w:r>
-      <w:r>
-        <w:rPr>
-          <w:spacing w:val="-3"/>
-          <w:sz w:val="22"/>
-        </w:rPr>
-        <w:t xml:space="preserve"> </w:t>
-      </w:r>
-      <w:r>
-        <w:rPr>
-          <w:spacing w:val="-2"/>
-          <w:sz w:val="22"/>
-        </w:rPr>
-        <w:t>employees</w:t>
-      </w:r>
-    </w:p>
-    <w:p>
-      <w:pPr>
-        <w:pStyle w:val="6"/>
-        <w:numPr>
-          <w:ilvl w:val="0"/>
-          <w:numId w:val="2"/>
-        </w:numPr>
-        <w:tabs>
-          <w:tab w:val="left" w:pos="523"/>
-        </w:tabs>
-        <w:spacing w:before="19" w:after="0" w:line="240" w:lineRule="auto"/>
-        <w:ind w:left="523" w:right="0" w:hanging="358"/>
-        <w:jc w:val="left"/>
-        <w:rPr>
-          <w:sz w:val="22"/>
-        </w:rPr>
-      </w:pPr>
-      <w:r>
-        <w:rPr>
-          <w:sz w:val="22"/>
-        </w:rPr>
-        <w:t>count</w:t>
-      </w:r>
-      <w:r>
-        <w:rPr>
-          <w:spacing w:val="-4"/>
-          <w:sz w:val="22"/>
-        </w:rPr>
-        <w:t xml:space="preserve"> </w:t>
-      </w:r>
-      <w:r>
-        <w:rPr>
-          <w:sz w:val="22"/>
-        </w:rPr>
-        <w:t>how</w:t>
-      </w:r>
-      <w:r>
-        <w:rPr>
-          <w:spacing w:val="-5"/>
-          <w:sz w:val="22"/>
-        </w:rPr>
-        <w:t xml:space="preserve"> </w:t>
-      </w:r>
-      <w:r>
-        <w:rPr>
-          <w:sz w:val="22"/>
-        </w:rPr>
-        <w:t>many</w:t>
-      </w:r>
-      <w:r>
-        <w:rPr>
-          <w:spacing w:val="-3"/>
-          <w:sz w:val="22"/>
-        </w:rPr>
-        <w:t xml:space="preserve"> </w:t>
-      </w:r>
-      <w:r>
-        <w:rPr>
-          <w:sz w:val="22"/>
-        </w:rPr>
-        <w:t>employees</w:t>
-      </w:r>
-      <w:r>
-        <w:rPr>
-          <w:spacing w:val="-4"/>
-          <w:sz w:val="22"/>
-        </w:rPr>
-        <w:t xml:space="preserve"> </w:t>
-      </w:r>
-      <w:r>
-        <w:rPr>
-          <w:sz w:val="22"/>
-        </w:rPr>
-        <w:t>earn</w:t>
-      </w:r>
-      <w:r>
-        <w:rPr>
-          <w:spacing w:val="-5"/>
-          <w:sz w:val="22"/>
-        </w:rPr>
-        <w:t xml:space="preserve"> </w:t>
-      </w:r>
-      <w:r>
-        <w:rPr>
-          <w:sz w:val="22"/>
-        </w:rPr>
-        <w:t>salary</w:t>
-      </w:r>
-      <w:r>
-        <w:rPr>
-          <w:spacing w:val="-5"/>
-          <w:sz w:val="22"/>
-        </w:rPr>
-        <w:t xml:space="preserve"> </w:t>
-      </w:r>
-      <w:r>
-        <w:rPr>
-          <w:sz w:val="22"/>
-        </w:rPr>
-        <w:t>more</w:t>
-      </w:r>
-      <w:r>
-        <w:rPr>
-          <w:spacing w:val="-5"/>
-          <w:sz w:val="22"/>
-        </w:rPr>
-        <w:t xml:space="preserve"> </w:t>
-      </w:r>
-      <w:r>
-        <w:rPr>
-          <w:sz w:val="22"/>
-        </w:rPr>
-        <w:t>than</w:t>
-      </w:r>
-      <w:r>
-        <w:rPr>
-          <w:spacing w:val="-6"/>
-          <w:sz w:val="22"/>
-        </w:rPr>
-        <w:t xml:space="preserve"> </w:t>
-      </w:r>
-      <w:r>
-        <w:rPr>
-          <w:sz w:val="22"/>
-        </w:rPr>
-        <w:t>2000</w:t>
-      </w:r>
-      <w:r>
-        <w:rPr>
-          <w:spacing w:val="-3"/>
-          <w:sz w:val="22"/>
-        </w:rPr>
-        <w:t xml:space="preserve"> </w:t>
-      </w:r>
-      <w:r>
-        <w:rPr>
-          <w:sz w:val="22"/>
-        </w:rPr>
-        <w:t>in</w:t>
-      </w:r>
-      <w:r>
-        <w:rPr>
-          <w:spacing w:val="-6"/>
-          <w:sz w:val="22"/>
-        </w:rPr>
-        <w:t xml:space="preserve"> </w:t>
-      </w:r>
-      <w:r>
-        <w:rPr>
-          <w:sz w:val="22"/>
-        </w:rPr>
-        <w:t>each</w:t>
-      </w:r>
-      <w:r>
-        <w:rPr>
-          <w:spacing w:val="-3"/>
-          <w:sz w:val="22"/>
-        </w:rPr>
-        <w:t xml:space="preserve"> </w:t>
-      </w:r>
-      <w:r>
-        <w:rPr>
-          <w:spacing w:val="-5"/>
-          <w:sz w:val="22"/>
-        </w:rPr>
-        <w:t>job</w:t>
-      </w:r>
-    </w:p>
-    <w:p>
-      <w:pPr>
-        <w:pStyle w:val="6"/>
-        <w:numPr>
-          <w:ilvl w:val="0"/>
-          <w:numId w:val="2"/>
-        </w:numPr>
-        <w:tabs>
-          <w:tab w:val="left" w:pos="523"/>
-        </w:tabs>
-        <w:spacing w:before="22" w:after="0" w:line="240" w:lineRule="auto"/>
-        <w:ind w:left="523" w:right="0" w:hanging="358"/>
-        <w:jc w:val="left"/>
-        <w:rPr>
-          <w:sz w:val="22"/>
-        </w:rPr>
-      </w:pPr>
-      <w:r>
-        <w:rPr>
-          <w:sz w:val="22"/>
-        </w:rPr>
-        <w:t>list</w:t>
-      </w:r>
-      <w:r>
-        <w:rPr>
-          <w:spacing w:val="-2"/>
-          <w:sz w:val="22"/>
-        </w:rPr>
-        <w:t xml:space="preserve"> </w:t>
-      </w:r>
-      <w:r>
-        <w:rPr>
-          <w:sz w:val="22"/>
-        </w:rPr>
-        <w:t>all</w:t>
-      </w:r>
-      <w:r>
-        <w:rPr>
-          <w:spacing w:val="-3"/>
-          <w:sz w:val="22"/>
-        </w:rPr>
-        <w:t xml:space="preserve"> </w:t>
-      </w:r>
-      <w:r>
-        <w:rPr>
-          <w:sz w:val="22"/>
-        </w:rPr>
-        <w:t>enames</w:t>
-      </w:r>
-      <w:r>
-        <w:rPr>
-          <w:spacing w:val="-2"/>
-          <w:sz w:val="22"/>
-        </w:rPr>
-        <w:t xml:space="preserve"> </w:t>
-      </w:r>
-      <w:r>
-        <w:rPr>
-          <w:sz w:val="22"/>
-        </w:rPr>
-        <w:t>and</w:t>
-      </w:r>
-      <w:r>
-        <w:rPr>
-          <w:spacing w:val="-4"/>
-          <w:sz w:val="22"/>
-        </w:rPr>
-        <w:t xml:space="preserve"> </w:t>
-      </w:r>
-      <w:r>
-        <w:rPr>
-          <w:sz w:val="22"/>
-        </w:rPr>
-        <w:t>jobs</w:t>
-      </w:r>
-      <w:r>
-        <w:rPr>
-          <w:spacing w:val="-3"/>
-          <w:sz w:val="22"/>
-        </w:rPr>
-        <w:t xml:space="preserve"> </w:t>
-      </w:r>
-      <w:r>
-        <w:rPr>
-          <w:sz w:val="22"/>
-        </w:rPr>
-        <w:t>in</w:t>
-      </w:r>
-      <w:r>
-        <w:rPr>
-          <w:spacing w:val="-2"/>
-          <w:sz w:val="22"/>
-        </w:rPr>
-        <w:t xml:space="preserve"> </w:t>
-      </w:r>
-      <w:r>
-        <w:rPr>
-          <w:sz w:val="22"/>
-        </w:rPr>
-        <w:t>small</w:t>
-      </w:r>
-      <w:r>
-        <w:rPr>
-          <w:spacing w:val="-3"/>
-          <w:sz w:val="22"/>
-        </w:rPr>
-        <w:t xml:space="preserve"> </w:t>
-      </w:r>
-      <w:r>
-        <w:rPr>
-          <w:sz w:val="22"/>
-        </w:rPr>
-        <w:t>case</w:t>
-      </w:r>
-      <w:r>
-        <w:rPr>
-          <w:spacing w:val="-1"/>
-          <w:sz w:val="22"/>
-        </w:rPr>
-        <w:t xml:space="preserve"> </w:t>
-      </w:r>
-      <w:r>
-        <w:rPr>
-          <w:spacing w:val="-2"/>
-          <w:sz w:val="22"/>
-        </w:rPr>
-        <w:t>letter</w:t>
-      </w:r>
-    </w:p>
-    <w:p>
-      <w:pPr>
-        <w:pStyle w:val="6"/>
-        <w:numPr>
-          <w:ilvl w:val="0"/>
-          <w:numId w:val="2"/>
-        </w:numPr>
-        <w:tabs>
-          <w:tab w:val="left" w:pos="523"/>
-          <w:tab w:val="left" w:pos="525"/>
-        </w:tabs>
-        <w:spacing w:before="22" w:after="0" w:line="259" w:lineRule="auto"/>
-        <w:ind w:left="525" w:right="228" w:hanging="360"/>
-        <w:jc w:val="left"/>
-        <w:rPr>
-          <w:sz w:val="22"/>
-        </w:rPr>
-      </w:pPr>
-      <w:r>
-        <w:rPr>
-          <w:sz w:val="22"/>
-        </w:rPr>
-        <w:t>list all</w:t>
-      </w:r>
-      <w:r>
-        <w:rPr>
-          <w:spacing w:val="-2"/>
-          <w:sz w:val="22"/>
-        </w:rPr>
-        <w:t xml:space="preserve"> </w:t>
-      </w:r>
-      <w:r>
-        <w:rPr>
-          <w:sz w:val="22"/>
-        </w:rPr>
-        <w:t>names</w:t>
-      </w:r>
-      <w:r>
-        <w:rPr>
-          <w:spacing w:val="-3"/>
-          <w:sz w:val="22"/>
-        </w:rPr>
-        <w:t xml:space="preserve"> </w:t>
-      </w:r>
-      <w:r>
-        <w:rPr>
-          <w:sz w:val="22"/>
-        </w:rPr>
-        <w:t>and</w:t>
-      </w:r>
-      <w:r>
-        <w:rPr>
-          <w:spacing w:val="-2"/>
-          <w:sz w:val="22"/>
-        </w:rPr>
-        <w:t xml:space="preserve"> </w:t>
-      </w:r>
-      <w:r>
-        <w:rPr>
-          <w:sz w:val="22"/>
-        </w:rPr>
-        <w:t>jobs</w:t>
-      </w:r>
-      <w:r>
-        <w:rPr>
-          <w:spacing w:val="-3"/>
-          <w:sz w:val="22"/>
-        </w:rPr>
-        <w:t xml:space="preserve"> </w:t>
-      </w:r>
-      <w:r>
-        <w:rPr>
-          <w:sz w:val="22"/>
-        </w:rPr>
-        <w:t>so</w:t>
-      </w:r>
-      <w:r>
-        <w:rPr>
-          <w:spacing w:val="-3"/>
-          <w:sz w:val="22"/>
-        </w:rPr>
-        <w:t xml:space="preserve"> </w:t>
-      </w:r>
-      <w:r>
-        <w:rPr>
-          <w:sz w:val="22"/>
-        </w:rPr>
-        <w:t>that</w:t>
-      </w:r>
-      <w:r>
-        <w:rPr>
-          <w:spacing w:val="-1"/>
-          <w:sz w:val="22"/>
-        </w:rPr>
-        <w:t xml:space="preserve"> </w:t>
-      </w:r>
-      <w:r>
-        <w:rPr>
-          <w:sz w:val="22"/>
-        </w:rPr>
-        <w:t>the</w:t>
-      </w:r>
-      <w:r>
-        <w:rPr>
-          <w:spacing w:val="-1"/>
-          <w:sz w:val="22"/>
-        </w:rPr>
-        <w:t xml:space="preserve"> </w:t>
-      </w:r>
-      <w:r>
-        <w:rPr>
-          <w:sz w:val="22"/>
-        </w:rPr>
-        <w:t>length</w:t>
-      </w:r>
-      <w:r>
-        <w:rPr>
-          <w:spacing w:val="-4"/>
-          <w:sz w:val="22"/>
-        </w:rPr>
-        <w:t xml:space="preserve"> </w:t>
-      </w:r>
-      <w:r>
-        <w:rPr>
-          <w:sz w:val="22"/>
-        </w:rPr>
-        <w:t>of</w:t>
-      </w:r>
-      <w:r>
-        <w:rPr>
-          <w:spacing w:val="-1"/>
-          <w:sz w:val="22"/>
-        </w:rPr>
-        <w:t xml:space="preserve"> </w:t>
-      </w:r>
-      <w:r>
-        <w:rPr>
-          <w:sz w:val="22"/>
-        </w:rPr>
-        <w:t>name</w:t>
-      </w:r>
-      <w:r>
-        <w:rPr>
-          <w:spacing w:val="-1"/>
-          <w:sz w:val="22"/>
-        </w:rPr>
-        <w:t xml:space="preserve"> </w:t>
-      </w:r>
-      <w:r>
-        <w:rPr>
-          <w:sz w:val="22"/>
-        </w:rPr>
-        <w:t>should</w:t>
-      </w:r>
-      <w:r>
-        <w:rPr>
-          <w:spacing w:val="-3"/>
-          <w:sz w:val="22"/>
-        </w:rPr>
-        <w:t xml:space="preserve"> </w:t>
-      </w:r>
-      <w:r>
-        <w:rPr>
-          <w:sz w:val="22"/>
-        </w:rPr>
-        <w:t>be</w:t>
-      </w:r>
-      <w:r>
-        <w:rPr>
-          <w:spacing w:val="-1"/>
-          <w:sz w:val="22"/>
-        </w:rPr>
-        <w:t xml:space="preserve"> </w:t>
-      </w:r>
-      <w:r>
-        <w:rPr>
-          <w:sz w:val="22"/>
-        </w:rPr>
-        <w:t>15</w:t>
-      </w:r>
-      <w:r>
-        <w:rPr>
-          <w:spacing w:val="-1"/>
-          <w:sz w:val="22"/>
-        </w:rPr>
-        <w:t xml:space="preserve"> </w:t>
-      </w:r>
-      <w:r>
-        <w:rPr>
-          <w:sz w:val="22"/>
-        </w:rPr>
-        <w:t>if</w:t>
-      </w:r>
-      <w:r>
-        <w:rPr>
-          <w:spacing w:val="-1"/>
-          <w:sz w:val="22"/>
-        </w:rPr>
-        <w:t xml:space="preserve"> </w:t>
-      </w:r>
-      <w:r>
-        <w:rPr>
-          <w:sz w:val="22"/>
-        </w:rPr>
-        <w:t>it</w:t>
-      </w:r>
-      <w:r>
-        <w:rPr>
-          <w:spacing w:val="-3"/>
-          <w:sz w:val="22"/>
-        </w:rPr>
-        <w:t xml:space="preserve"> </w:t>
-      </w:r>
-      <w:r>
-        <w:rPr>
-          <w:sz w:val="22"/>
-        </w:rPr>
-        <w:t>is smaller</w:t>
-      </w:r>
-      <w:r>
-        <w:rPr>
-          <w:spacing w:val="-2"/>
-          <w:sz w:val="22"/>
-        </w:rPr>
-        <w:t xml:space="preserve"> </w:t>
-      </w:r>
-      <w:r>
-        <w:rPr>
-          <w:sz w:val="22"/>
-        </w:rPr>
-        <w:t>then</w:t>
-      </w:r>
-      <w:r>
-        <w:rPr>
-          <w:spacing w:val="-4"/>
-          <w:sz w:val="22"/>
-        </w:rPr>
-        <w:t xml:space="preserve"> </w:t>
-      </w:r>
-      <w:r>
-        <w:rPr>
-          <w:sz w:val="22"/>
-        </w:rPr>
-        <w:t>add</w:t>
-      </w:r>
-      <w:r>
-        <w:rPr>
-          <w:spacing w:val="-3"/>
-          <w:sz w:val="22"/>
-        </w:rPr>
-        <w:t xml:space="preserve"> </w:t>
-      </w:r>
-      <w:r>
-        <w:rPr>
-          <w:sz w:val="22"/>
-        </w:rPr>
-        <w:t>spaces to left</w:t>
-      </w:r>
-    </w:p>
-    <w:p>
-      <w:pPr>
-        <w:pStyle w:val="6"/>
-        <w:numPr>
-          <w:ilvl w:val="0"/>
-          <w:numId w:val="2"/>
-        </w:numPr>
-        <w:tabs>
-          <w:tab w:val="left" w:pos="523"/>
-        </w:tabs>
-        <w:spacing w:before="0" w:after="0" w:line="267" w:lineRule="exact"/>
-        <w:ind w:left="523" w:right="0" w:hanging="358"/>
-        <w:jc w:val="left"/>
-        <w:rPr>
-          <w:sz w:val="22"/>
-        </w:rPr>
-      </w:pPr>
-      <w:r>
-        <w:rPr>
-          <w:sz w:val="22"/>
-        </w:rPr>
-        <w:t>display</w:t>
-      </w:r>
-      <w:r>
-        <w:rPr>
-          <w:spacing w:val="-6"/>
-          <w:sz w:val="22"/>
-        </w:rPr>
-        <w:t xml:space="preserve"> </w:t>
-      </w:r>
-      <w:r>
-        <w:rPr>
-          <w:sz w:val="22"/>
-        </w:rPr>
-        <w:t>min</w:t>
-      </w:r>
-      <w:r>
-        <w:rPr>
-          <w:spacing w:val="-7"/>
-          <w:sz w:val="22"/>
-        </w:rPr>
-        <w:t xml:space="preserve"> </w:t>
-      </w:r>
-      <w:r>
-        <w:rPr>
-          <w:sz w:val="22"/>
-        </w:rPr>
-        <w:t>sal,max</w:t>
-      </w:r>
-      <w:r>
-        <w:rPr>
-          <w:spacing w:val="-3"/>
-          <w:sz w:val="22"/>
-        </w:rPr>
-        <w:t xml:space="preserve"> </w:t>
-      </w:r>
-      <w:r>
-        <w:rPr>
-          <w:sz w:val="22"/>
-        </w:rPr>
-        <w:t>sal,</w:t>
-      </w:r>
-      <w:r>
-        <w:rPr>
-          <w:spacing w:val="-3"/>
-          <w:sz w:val="22"/>
-        </w:rPr>
-        <w:t xml:space="preserve"> </w:t>
-      </w:r>
-      <w:r>
-        <w:rPr>
-          <w:sz w:val="22"/>
-        </w:rPr>
-        <w:t>average</w:t>
-      </w:r>
-      <w:r>
-        <w:rPr>
-          <w:spacing w:val="-3"/>
-          <w:sz w:val="22"/>
-        </w:rPr>
-        <w:t xml:space="preserve"> </w:t>
-      </w:r>
-      <w:r>
-        <w:rPr>
-          <w:sz w:val="22"/>
-        </w:rPr>
-        <w:t>sal</w:t>
-      </w:r>
-      <w:r>
-        <w:rPr>
-          <w:spacing w:val="-1"/>
-          <w:sz w:val="22"/>
-        </w:rPr>
-        <w:t xml:space="preserve"> </w:t>
-      </w:r>
-      <w:r>
-        <w:rPr>
-          <w:sz w:val="22"/>
-        </w:rPr>
-        <w:t>for</w:t>
-      </w:r>
-      <w:r>
-        <w:rPr>
-          <w:spacing w:val="-4"/>
-          <w:sz w:val="22"/>
-        </w:rPr>
-        <w:t xml:space="preserve"> </w:t>
-      </w:r>
-      <w:r>
-        <w:rPr>
-          <w:sz w:val="22"/>
-        </w:rPr>
-        <w:t>all</w:t>
-      </w:r>
-      <w:r>
-        <w:rPr>
-          <w:spacing w:val="-5"/>
-          <w:sz w:val="22"/>
-        </w:rPr>
-        <w:t xml:space="preserve"> </w:t>
-      </w:r>
-      <w:r>
-        <w:rPr>
-          <w:sz w:val="22"/>
-        </w:rPr>
-        <w:t>employees</w:t>
-      </w:r>
-      <w:r>
-        <w:rPr>
-          <w:spacing w:val="-8"/>
-          <w:sz w:val="22"/>
-        </w:rPr>
-        <w:t xml:space="preserve"> </w:t>
-      </w:r>
-      <w:r>
-        <w:rPr>
-          <w:sz w:val="22"/>
-        </w:rPr>
-        <w:t>working</w:t>
-      </w:r>
-      <w:r>
-        <w:rPr>
-          <w:spacing w:val="-4"/>
-          <w:sz w:val="22"/>
-        </w:rPr>
-        <w:t xml:space="preserve"> </w:t>
-      </w:r>
-      <w:r>
-        <w:rPr>
-          <w:sz w:val="22"/>
-        </w:rPr>
-        <w:t>under</w:t>
-      </w:r>
-      <w:r>
-        <w:rPr>
-          <w:spacing w:val="-5"/>
-          <w:sz w:val="22"/>
-        </w:rPr>
-        <w:t xml:space="preserve"> </w:t>
-      </w:r>
-      <w:r>
-        <w:rPr>
-          <w:sz w:val="22"/>
-        </w:rPr>
-        <w:t>same</w:t>
-      </w:r>
-      <w:r>
-        <w:rPr>
-          <w:spacing w:val="-5"/>
-          <w:sz w:val="22"/>
-        </w:rPr>
-        <w:t xml:space="preserve"> </w:t>
-      </w:r>
-      <w:r>
-        <w:rPr>
-          <w:spacing w:val="-2"/>
-          <w:sz w:val="22"/>
-        </w:rPr>
-        <w:t>manager</w:t>
-      </w:r>
-    </w:p>
-    <w:p>
-      <w:pPr>
-        <w:pStyle w:val="6"/>
-        <w:numPr>
-          <w:ilvl w:val="0"/>
-          <w:numId w:val="2"/>
-        </w:numPr>
-        <w:tabs>
-          <w:tab w:val="left" w:pos="523"/>
-        </w:tabs>
-        <w:spacing w:before="22" w:after="0" w:line="240" w:lineRule="auto"/>
-        <w:ind w:left="523" w:right="0" w:hanging="358"/>
-        <w:jc w:val="left"/>
-        <w:rPr>
-          <w:sz w:val="22"/>
-        </w:rPr>
-      </w:pPr>
-      <w:r>
-        <w:rPr>
-          <w:sz w:val="22"/>
-        </w:rPr>
-        <w:t>find</w:t>
-      </w:r>
-      <w:r>
-        <w:rPr>
-          <w:spacing w:val="-6"/>
-          <w:sz w:val="22"/>
-        </w:rPr>
-        <w:t xml:space="preserve"> </w:t>
-      </w:r>
-      <w:r>
-        <w:rPr>
-          <w:sz w:val="22"/>
-        </w:rPr>
-        <w:t>sum</w:t>
-      </w:r>
-      <w:r>
-        <w:rPr>
-          <w:spacing w:val="-5"/>
-          <w:sz w:val="22"/>
-        </w:rPr>
-        <w:t xml:space="preserve"> </w:t>
-      </w:r>
-      <w:r>
-        <w:rPr>
-          <w:sz w:val="22"/>
-        </w:rPr>
-        <w:t>of</w:t>
-      </w:r>
-      <w:r>
-        <w:rPr>
-          <w:spacing w:val="-4"/>
-          <w:sz w:val="22"/>
-        </w:rPr>
-        <w:t xml:space="preserve"> </w:t>
-      </w:r>
-      <w:r>
-        <w:rPr>
-          <w:sz w:val="22"/>
-        </w:rPr>
-        <w:t>total</w:t>
-      </w:r>
-      <w:r>
-        <w:rPr>
-          <w:spacing w:val="-6"/>
-          <w:sz w:val="22"/>
-        </w:rPr>
-        <w:t xml:space="preserve"> </w:t>
-      </w:r>
-      <w:r>
-        <w:rPr>
-          <w:sz w:val="22"/>
-        </w:rPr>
-        <w:t>earnings(sal+comm),</w:t>
-      </w:r>
-      <w:r>
-        <w:rPr>
-          <w:spacing w:val="-5"/>
-          <w:sz w:val="22"/>
-        </w:rPr>
-        <w:t xml:space="preserve"> </w:t>
-      </w:r>
-      <w:r>
-        <w:rPr>
-          <w:sz w:val="22"/>
-        </w:rPr>
-        <w:t>average</w:t>
-      </w:r>
-      <w:r>
-        <w:rPr>
-          <w:spacing w:val="-6"/>
-          <w:sz w:val="22"/>
-        </w:rPr>
-        <w:t xml:space="preserve"> </w:t>
-      </w:r>
-      <w:r>
-        <w:rPr>
-          <w:sz w:val="22"/>
-        </w:rPr>
-        <w:t>of</w:t>
-      </w:r>
-      <w:r>
-        <w:rPr>
-          <w:spacing w:val="-4"/>
-          <w:sz w:val="22"/>
-        </w:rPr>
-        <w:t xml:space="preserve"> </w:t>
-      </w:r>
-      <w:r>
-        <w:rPr>
-          <w:spacing w:val="-2"/>
-          <w:sz w:val="22"/>
-        </w:rPr>
-        <w:t>sal+comm,</w:t>
-      </w:r>
-    </w:p>
-    <w:p>
-      <w:pPr>
-        <w:pStyle w:val="4"/>
-        <w:spacing w:before="22"/>
-        <w:ind w:left="575"/>
-      </w:pPr>
-      <w:r>
-        <w:t>for</w:t>
-      </w:r>
-      <w:r>
-        <w:rPr>
-          <w:spacing w:val="-5"/>
-        </w:rPr>
-        <w:t xml:space="preserve"> </w:t>
-      </w:r>
-      <w:r>
-        <w:t>all</w:t>
-      </w:r>
-      <w:r>
-        <w:rPr>
-          <w:spacing w:val="-4"/>
-        </w:rPr>
-        <w:t xml:space="preserve"> </w:t>
-      </w:r>
-      <w:r>
-        <w:t>employees</w:t>
-      </w:r>
-      <w:r>
-        <w:rPr>
-          <w:spacing w:val="-2"/>
-        </w:rPr>
-        <w:t xml:space="preserve"> </w:t>
-      </w:r>
-      <w:r>
-        <w:t>who</w:t>
-      </w:r>
-      <w:r>
-        <w:rPr>
-          <w:spacing w:val="-2"/>
-        </w:rPr>
-        <w:t xml:space="preserve"> </w:t>
-      </w:r>
-      <w:r>
-        <w:t>earn</w:t>
-      </w:r>
-      <w:r>
-        <w:rPr>
-          <w:spacing w:val="-3"/>
-        </w:rPr>
-        <w:t xml:space="preserve"> </w:t>
-      </w:r>
-      <w:r>
-        <w:t>sal</w:t>
-      </w:r>
-      <w:r>
-        <w:rPr>
-          <w:spacing w:val="-2"/>
-        </w:rPr>
-        <w:t xml:space="preserve"> </w:t>
-      </w:r>
-      <w:r>
-        <w:t>&gt;</w:t>
-      </w:r>
-      <w:r>
-        <w:rPr>
-          <w:spacing w:val="-4"/>
-        </w:rPr>
-        <w:t xml:space="preserve"> </w:t>
-      </w:r>
-      <w:r>
-        <w:t>2000</w:t>
-      </w:r>
-      <w:r>
-        <w:rPr>
-          <w:spacing w:val="-4"/>
-        </w:rPr>
-        <w:t xml:space="preserve"> </w:t>
-      </w:r>
-      <w:r>
-        <w:t>and</w:t>
-      </w:r>
-      <w:r>
-        <w:rPr>
-          <w:spacing w:val="-3"/>
-        </w:rPr>
-        <w:t xml:space="preserve"> </w:t>
-      </w:r>
-      <w:r>
-        <w:t>work</w:t>
-      </w:r>
-      <w:r>
-        <w:rPr>
-          <w:spacing w:val="-3"/>
-        </w:rPr>
-        <w:t xml:space="preserve"> </w:t>
-      </w:r>
-      <w:r>
-        <w:t>in</w:t>
-      </w:r>
-      <w:r>
-        <w:rPr>
-          <w:spacing w:val="-4"/>
-        </w:rPr>
-        <w:t xml:space="preserve"> </w:t>
-      </w:r>
-      <w:r>
-        <w:t>either</w:t>
-      </w:r>
-      <w:r>
-        <w:rPr>
-          <w:spacing w:val="-2"/>
-        </w:rPr>
-        <w:t xml:space="preserve"> </w:t>
-      </w:r>
-      <w:r>
-        <w:t>dept</w:t>
-      </w:r>
-      <w:r>
-        <w:rPr>
-          <w:spacing w:val="-2"/>
-        </w:rPr>
-        <w:t xml:space="preserve"> </w:t>
-      </w:r>
-      <w:r>
-        <w:t>no</w:t>
-      </w:r>
-      <w:r>
-        <w:rPr>
-          <w:spacing w:val="-2"/>
-        </w:rPr>
-        <w:t xml:space="preserve"> </w:t>
-      </w:r>
-      <w:r>
-        <w:t>10</w:t>
-      </w:r>
-      <w:r>
-        <w:rPr>
-          <w:spacing w:val="-4"/>
-        </w:rPr>
-        <w:t xml:space="preserve"> </w:t>
-      </w:r>
-      <w:r>
-        <w:t>or</w:t>
-      </w:r>
-      <w:r>
-        <w:rPr>
-          <w:spacing w:val="-3"/>
-        </w:rPr>
-        <w:t xml:space="preserve"> </w:t>
-      </w:r>
-      <w:r>
-        <w:rPr>
-          <w:spacing w:val="-5"/>
-        </w:rPr>
-        <w:t>20</w:t>
-      </w:r>
-    </w:p>
-    <w:p>
-      <w:pPr>
-        <w:pStyle w:val="6"/>
-        <w:numPr>
-          <w:ilvl w:val="0"/>
-          <w:numId w:val="2"/>
-        </w:numPr>
-        <w:tabs>
-          <w:tab w:val="left" w:pos="523"/>
-        </w:tabs>
-        <w:spacing w:before="22" w:after="0" w:line="240" w:lineRule="auto"/>
-        <w:ind w:left="523" w:right="0" w:hanging="358"/>
-        <w:jc w:val="left"/>
-        <w:rPr>
-          <w:sz w:val="22"/>
-        </w:rPr>
-      </w:pPr>
-      <w:r>
-        <w:rPr>
-          <w:sz w:val="22"/>
-        </w:rPr>
-        <w:t>list</w:t>
-      </w:r>
-      <w:r>
-        <w:rPr>
-          <w:spacing w:val="-2"/>
-          <w:sz w:val="22"/>
-        </w:rPr>
-        <w:t xml:space="preserve"> </w:t>
-      </w:r>
-      <w:r>
-        <w:rPr>
-          <w:sz w:val="22"/>
-        </w:rPr>
-        <w:t>all</w:t>
-      </w:r>
-      <w:r>
-        <w:rPr>
-          <w:spacing w:val="-4"/>
-          <w:sz w:val="22"/>
-        </w:rPr>
-        <w:t xml:space="preserve"> </w:t>
-      </w:r>
-      <w:r>
-        <w:rPr>
-          <w:sz w:val="22"/>
-        </w:rPr>
-        <w:t>employees</w:t>
-      </w:r>
-      <w:r>
-        <w:rPr>
-          <w:spacing w:val="-5"/>
-          <w:sz w:val="22"/>
-        </w:rPr>
-        <w:t xml:space="preserve"> </w:t>
-      </w:r>
-      <w:r>
-        <w:rPr>
-          <w:sz w:val="22"/>
-        </w:rPr>
-        <w:t>who</w:t>
-      </w:r>
-      <w:r>
-        <w:rPr>
-          <w:spacing w:val="-4"/>
-          <w:sz w:val="22"/>
-        </w:rPr>
-        <w:t xml:space="preserve"> </w:t>
-      </w:r>
-      <w:r>
-        <w:rPr>
-          <w:sz w:val="22"/>
-        </w:rPr>
-        <w:t>joined</w:t>
-      </w:r>
-      <w:r>
-        <w:rPr>
-          <w:spacing w:val="-3"/>
-          <w:sz w:val="22"/>
-        </w:rPr>
-        <w:t xml:space="preserve"> </w:t>
-      </w:r>
-      <w:r>
-        <w:rPr>
-          <w:sz w:val="22"/>
-        </w:rPr>
-        <w:t>in</w:t>
-      </w:r>
-      <w:r>
-        <w:rPr>
-          <w:spacing w:val="-4"/>
-          <w:sz w:val="22"/>
-        </w:rPr>
-        <w:t xml:space="preserve"> </w:t>
-      </w:r>
-      <w:r>
-        <w:rPr>
-          <w:sz w:val="22"/>
-        </w:rPr>
-        <w:t>Aug</w:t>
-      </w:r>
-      <w:r>
-        <w:rPr>
-          <w:spacing w:val="-3"/>
-          <w:sz w:val="22"/>
-        </w:rPr>
-        <w:t xml:space="preserve"> </w:t>
-      </w:r>
-      <w:r>
-        <w:rPr>
-          <w:sz w:val="22"/>
-        </w:rPr>
-        <w:t>1980</w:t>
-      </w:r>
-      <w:r>
-        <w:rPr>
-          <w:spacing w:val="-3"/>
-          <w:sz w:val="22"/>
-        </w:rPr>
-        <w:t xml:space="preserve"> </w:t>
-      </w:r>
-      <w:r>
-        <w:rPr>
-          <w:sz w:val="22"/>
-        </w:rPr>
-        <w:t>and</w:t>
-      </w:r>
-      <w:r>
-        <w:rPr>
-          <w:spacing w:val="-5"/>
-          <w:sz w:val="22"/>
-        </w:rPr>
-        <w:t xml:space="preserve"> </w:t>
-      </w:r>
-      <w:r>
-        <w:rPr>
-          <w:sz w:val="22"/>
-        </w:rPr>
-        <w:t>salary</w:t>
-      </w:r>
-      <w:r>
-        <w:rPr>
-          <w:spacing w:val="-3"/>
-          <w:sz w:val="22"/>
-        </w:rPr>
-        <w:t xml:space="preserve"> </w:t>
-      </w:r>
-      <w:r>
-        <w:rPr>
-          <w:sz w:val="22"/>
-        </w:rPr>
-        <w:t>is</w:t>
-      </w:r>
-      <w:r>
-        <w:rPr>
-          <w:spacing w:val="-2"/>
-          <w:sz w:val="22"/>
-        </w:rPr>
-        <w:t xml:space="preserve"> </w:t>
-      </w:r>
-      <w:r>
-        <w:rPr>
-          <w:sz w:val="22"/>
-        </w:rPr>
-        <w:t>&gt;1500</w:t>
-      </w:r>
-      <w:r>
-        <w:rPr>
-          <w:spacing w:val="-3"/>
-          <w:sz w:val="22"/>
-        </w:rPr>
-        <w:t xml:space="preserve"> </w:t>
-      </w:r>
-      <w:r>
-        <w:rPr>
-          <w:sz w:val="22"/>
-        </w:rPr>
-        <w:t>and</w:t>
-      </w:r>
-      <w:r>
-        <w:rPr>
-          <w:spacing w:val="-7"/>
-          <w:sz w:val="22"/>
-        </w:rPr>
-        <w:t xml:space="preserve"> </w:t>
-      </w:r>
-      <w:r>
-        <w:rPr>
-          <w:sz w:val="22"/>
-        </w:rPr>
-        <w:t>&lt;</w:t>
-      </w:r>
-      <w:r>
-        <w:rPr>
-          <w:spacing w:val="-2"/>
-          <w:sz w:val="22"/>
-        </w:rPr>
-        <w:t xml:space="preserve"> </w:t>
-      </w:r>
-      <w:r>
-        <w:rPr>
-          <w:spacing w:val="-4"/>
-          <w:sz w:val="22"/>
-        </w:rPr>
-        <w:t>2500</w:t>
-      </w:r>
-    </w:p>
-    <w:p>
-      <w:pPr>
-        <w:pStyle w:val="6"/>
-        <w:numPr>
-          <w:ilvl w:val="0"/>
-          <w:numId w:val="2"/>
-        </w:numPr>
-        <w:tabs>
-          <w:tab w:val="left" w:pos="523"/>
-        </w:tabs>
-        <w:spacing w:before="19" w:after="0" w:line="240" w:lineRule="auto"/>
-        <w:ind w:left="523" w:right="0" w:hanging="358"/>
-        <w:jc w:val="left"/>
-        <w:rPr>
-          <w:sz w:val="22"/>
-        </w:rPr>
-      </w:pPr>
-      <w:r>
-        <w:rPr>
-          <w:sz w:val="22"/>
-        </w:rPr>
-        <w:t>list</w:t>
-      </w:r>
-      <w:r>
-        <w:rPr>
-          <w:spacing w:val="-2"/>
-          <w:sz w:val="22"/>
-        </w:rPr>
-        <w:t xml:space="preserve"> </w:t>
-      </w:r>
-      <w:r>
-        <w:rPr>
-          <w:sz w:val="22"/>
-        </w:rPr>
-        <w:t>all</w:t>
-      </w:r>
-      <w:r>
-        <w:rPr>
-          <w:spacing w:val="-3"/>
-          <w:sz w:val="22"/>
-        </w:rPr>
-        <w:t xml:space="preserve"> </w:t>
-      </w:r>
-      <w:r>
-        <w:rPr>
-          <w:sz w:val="22"/>
-        </w:rPr>
-        <w:t>employees</w:t>
-      </w:r>
-      <w:r>
-        <w:rPr>
-          <w:spacing w:val="-1"/>
-          <w:sz w:val="22"/>
-        </w:rPr>
-        <w:t xml:space="preserve"> </w:t>
-      </w:r>
-      <w:r>
-        <w:rPr>
-          <w:sz w:val="22"/>
-        </w:rPr>
-        <w:t>joined</w:t>
-      </w:r>
-      <w:r>
-        <w:rPr>
-          <w:spacing w:val="-2"/>
-          <w:sz w:val="22"/>
-        </w:rPr>
-        <w:t xml:space="preserve"> </w:t>
-      </w:r>
-      <w:r>
-        <w:rPr>
-          <w:sz w:val="22"/>
-        </w:rPr>
-        <w:t>in</w:t>
-      </w:r>
-      <w:r>
-        <w:rPr>
-          <w:spacing w:val="-5"/>
-          <w:sz w:val="22"/>
-        </w:rPr>
-        <w:t xml:space="preserve"> </w:t>
-      </w:r>
-      <w:r>
-        <w:rPr>
-          <w:sz w:val="22"/>
-        </w:rPr>
-        <w:t>either</w:t>
-      </w:r>
-      <w:r>
-        <w:rPr>
-          <w:spacing w:val="-2"/>
-          <w:sz w:val="22"/>
-        </w:rPr>
-        <w:t xml:space="preserve"> </w:t>
-      </w:r>
-      <w:r>
-        <w:rPr>
-          <w:sz w:val="22"/>
-        </w:rPr>
-        <w:t>aug</w:t>
-      </w:r>
-      <w:r>
-        <w:rPr>
-          <w:spacing w:val="-6"/>
-          <w:sz w:val="22"/>
-        </w:rPr>
-        <w:t xml:space="preserve"> </w:t>
-      </w:r>
-      <w:r>
-        <w:rPr>
-          <w:sz w:val="22"/>
-        </w:rPr>
-        <w:t>or</w:t>
-      </w:r>
-      <w:r>
-        <w:rPr>
-          <w:spacing w:val="-4"/>
-          <w:sz w:val="22"/>
-        </w:rPr>
-        <w:t xml:space="preserve"> </w:t>
-      </w:r>
-      <w:r>
-        <w:rPr>
-          <w:sz w:val="22"/>
-        </w:rPr>
-        <w:t>may</w:t>
-      </w:r>
-      <w:r>
-        <w:rPr>
-          <w:spacing w:val="-2"/>
-          <w:sz w:val="22"/>
-        </w:rPr>
-        <w:t xml:space="preserve"> </w:t>
-      </w:r>
-      <w:r>
-        <w:rPr>
-          <w:sz w:val="22"/>
-        </w:rPr>
-        <w:t>or</w:t>
-      </w:r>
-      <w:r>
-        <w:rPr>
-          <w:spacing w:val="-1"/>
-          <w:sz w:val="22"/>
-        </w:rPr>
-        <w:t xml:space="preserve"> </w:t>
-      </w:r>
-      <w:r>
-        <w:rPr>
-          <w:spacing w:val="-5"/>
-          <w:sz w:val="22"/>
-        </w:rPr>
-        <w:t>dec</w:t>
-      </w:r>
-    </w:p>
-    <w:p>
-      <w:pPr>
-        <w:pStyle w:val="6"/>
-        <w:numPr>
-          <w:ilvl w:val="0"/>
-          <w:numId w:val="2"/>
-        </w:numPr>
-        <w:tabs>
-          <w:tab w:val="left" w:pos="523"/>
-          <w:tab w:val="left" w:pos="525"/>
-        </w:tabs>
-        <w:spacing w:before="22" w:after="0" w:line="259" w:lineRule="auto"/>
-        <w:ind w:left="525" w:right="236" w:hanging="360"/>
-        <w:jc w:val="left"/>
-        <w:rPr>
-          <w:sz w:val="22"/>
-        </w:rPr>
-      </w:pPr>
-      <w:r>
-        <w:rPr>
-          <w:sz w:val="22"/>
-        </w:rPr>
-        <w:t>display</w:t>
-      </w:r>
-      <w:r>
-        <w:rPr>
-          <w:spacing w:val="-2"/>
-          <w:sz w:val="22"/>
-        </w:rPr>
-        <w:t xml:space="preserve"> </w:t>
-      </w:r>
-      <w:r>
-        <w:rPr>
-          <w:sz w:val="22"/>
-        </w:rPr>
-        <w:t>name</w:t>
-      </w:r>
-      <w:r>
-        <w:rPr>
-          <w:spacing w:val="-2"/>
-          <w:sz w:val="22"/>
-        </w:rPr>
-        <w:t xml:space="preserve"> </w:t>
-      </w:r>
-      <w:r>
-        <w:rPr>
-          <w:sz w:val="22"/>
-        </w:rPr>
-        <w:t>and</w:t>
-      </w:r>
-      <w:r>
-        <w:rPr>
-          <w:spacing w:val="-3"/>
-          <w:sz w:val="22"/>
-        </w:rPr>
-        <w:t xml:space="preserve"> </w:t>
-      </w:r>
-      <w:r>
-        <w:rPr>
-          <w:sz w:val="22"/>
-        </w:rPr>
-        <w:t>hiredate</w:t>
-      </w:r>
-      <w:r>
-        <w:rPr>
-          <w:spacing w:val="-4"/>
-          <w:sz w:val="22"/>
-        </w:rPr>
-        <w:t xml:space="preserve"> </w:t>
-      </w:r>
-      <w:r>
-        <w:rPr>
-          <w:sz w:val="22"/>
-        </w:rPr>
-        <w:t>in</w:t>
-      </w:r>
-      <w:r>
-        <w:rPr>
-          <w:spacing w:val="-4"/>
-          <w:sz w:val="22"/>
-        </w:rPr>
-        <w:t xml:space="preserve"> </w:t>
-      </w:r>
-      <w:r>
-        <w:rPr>
-          <w:sz w:val="22"/>
-        </w:rPr>
-        <w:t>dd/mm/yy</w:t>
-      </w:r>
-      <w:r>
-        <w:rPr>
-          <w:spacing w:val="-4"/>
-          <w:sz w:val="22"/>
-        </w:rPr>
-        <w:t xml:space="preserve"> </w:t>
-      </w:r>
-      <w:r>
-        <w:rPr>
-          <w:sz w:val="22"/>
-        </w:rPr>
-        <w:t>format for</w:t>
-      </w:r>
-      <w:r>
-        <w:rPr>
-          <w:spacing w:val="-2"/>
-          <w:sz w:val="22"/>
-        </w:rPr>
-        <w:t xml:space="preserve"> </w:t>
-      </w:r>
-      <w:r>
-        <w:rPr>
-          <w:sz w:val="22"/>
-        </w:rPr>
-        <w:t>all</w:t>
-      </w:r>
-      <w:r>
-        <w:rPr>
-          <w:spacing w:val="-5"/>
-          <w:sz w:val="22"/>
-        </w:rPr>
-        <w:t xml:space="preserve"> </w:t>
-      </w:r>
-      <w:r>
-        <w:rPr>
-          <w:sz w:val="22"/>
-        </w:rPr>
-        <w:t>employees</w:t>
-      </w:r>
-      <w:r>
-        <w:rPr>
-          <w:spacing w:val="-4"/>
-          <w:sz w:val="22"/>
-        </w:rPr>
-        <w:t xml:space="preserve"> </w:t>
-      </w:r>
-      <w:r>
-        <w:rPr>
-          <w:sz w:val="22"/>
-        </w:rPr>
-        <w:t>whose</w:t>
-      </w:r>
-      <w:r>
-        <w:rPr>
-          <w:spacing w:val="-2"/>
-          <w:sz w:val="22"/>
-        </w:rPr>
-        <w:t xml:space="preserve"> </w:t>
-      </w:r>
-      <w:r>
-        <w:rPr>
-          <w:sz w:val="22"/>
-        </w:rPr>
-        <w:t>job</w:t>
-      </w:r>
-      <w:r>
-        <w:rPr>
-          <w:spacing w:val="-3"/>
-          <w:sz w:val="22"/>
-        </w:rPr>
-        <w:t xml:space="preserve"> </w:t>
-      </w:r>
-      <w:r>
-        <w:rPr>
-          <w:sz w:val="22"/>
-        </w:rPr>
-        <w:t>is</w:t>
-      </w:r>
-      <w:r>
-        <w:rPr>
-          <w:spacing w:val="-4"/>
-          <w:sz w:val="22"/>
-        </w:rPr>
-        <w:t xml:space="preserve"> </w:t>
-      </w:r>
-      <w:r>
-        <w:rPr>
-          <w:sz w:val="22"/>
-        </w:rPr>
-        <w:t>clerk</w:t>
-      </w:r>
-      <w:r>
-        <w:rPr>
-          <w:spacing w:val="-2"/>
-          <w:sz w:val="22"/>
-        </w:rPr>
-        <w:t xml:space="preserve"> </w:t>
-      </w:r>
-      <w:r>
-        <w:rPr>
-          <w:sz w:val="22"/>
-        </w:rPr>
-        <w:t>and</w:t>
-      </w:r>
-      <w:r>
-        <w:rPr>
-          <w:spacing w:val="-4"/>
-          <w:sz w:val="22"/>
-        </w:rPr>
-        <w:t xml:space="preserve"> </w:t>
-      </w:r>
-      <w:r>
-        <w:rPr>
-          <w:sz w:val="22"/>
-        </w:rPr>
-        <w:t>they earn some commission</w:t>
-      </w:r>
-    </w:p>
-    <w:p>
-      <w:pPr>
-        <w:pStyle w:val="6"/>
-        <w:spacing w:after="0" w:line="259" w:lineRule="auto"/>
-        <w:jc w:val="left"/>
-        <w:rPr>
-          <w:sz w:val="22"/>
+        <w:ind w:left="525"/>
+        <w:rPr>
+          <w:lang w:val="en-US"/>
+        </w:rPr>
+      </w:pPr>
+      <w:r>
+        <w:rPr>
+          <w:lang w:val="en-US"/>
+        </w:rPr>
+        <w:t>Ans. select count(*)</w:t>
+      </w:r>
+    </w:p>
+    <w:p>
+      <w:pPr>
+        <w:ind w:left="525"/>
+        <w:rPr>
+          <w:lang w:val="en-US"/>
+        </w:rPr>
+      </w:pPr>
+      <w:r>
+        <w:rPr>
+          <w:lang w:val="en-US"/>
+        </w:rPr>
+        <w:t xml:space="preserve">    -&gt; from emp</w:t>
+      </w:r>
+    </w:p>
+    <w:p>
+      <w:pPr>
+        <w:ind w:left="525"/>
+        <w:rPr>
+          <w:lang w:val="en-US"/>
+        </w:rPr>
+      </w:pPr>
+      <w:r>
+        <w:rPr>
+          <w:lang w:val="en-US"/>
+        </w:rPr>
+        <w:t xml:space="preserve">    -&gt; group by comm</w:t>
+      </w:r>
+    </w:p>
+    <w:p>
+      <w:pPr>
+        <w:ind w:left="525"/>
+        <w:rPr>
+          <w:lang w:val="en-US"/>
+        </w:rPr>
+      </w:pPr>
+      <w:r>
+        <w:rPr>
+          <w:lang w:val="en-US"/>
+        </w:rPr>
+        <w:t xml:space="preserve">    -&gt; having comm is null;</w:t>
+      </w:r>
+    </w:p>
+    <w:p>
+      <w:pPr>
+        <w:numPr>
+          <w:ilvl w:val="0"/>
+          <w:numId w:val="3"/>
+        </w:numPr>
+        <w:rPr>
+          <w:b/>
+          <w:bCs/>
+          <w:lang w:val="en-US"/>
+        </w:rPr>
+      </w:pPr>
+      <w:r>
+        <w:rPr>
+          <w:b/>
+          <w:bCs/>
+          <w:lang w:val="en-US"/>
+        </w:rPr>
+        <w:t>find sum of sal of all employees working in dept no 10</w:t>
+      </w:r>
+    </w:p>
+    <w:p>
+      <w:pPr>
+        <w:rPr>
+          <w:lang w:val="en-US"/>
+        </w:rPr>
+      </w:pPr>
+      <w:r>
+        <w:rPr>
+          <w:lang w:val="en-US"/>
+        </w:rPr>
+        <w:t>Ans. select deptno,sum(sal)</w:t>
+      </w:r>
+    </w:p>
+    <w:p>
+      <w:pPr>
+        <w:rPr>
+          <w:lang w:val="en-US"/>
+        </w:rPr>
+      </w:pPr>
+      <w:r>
+        <w:rPr>
+          <w:lang w:val="en-US"/>
+        </w:rPr>
+        <w:t xml:space="preserve">    -&gt; from emp</w:t>
+      </w:r>
+    </w:p>
+    <w:p>
+      <w:pPr>
+        <w:rPr>
+          <w:lang w:val="en-US"/>
+        </w:rPr>
+      </w:pPr>
+      <w:r>
+        <w:rPr>
+          <w:lang w:val="en-US"/>
+        </w:rPr>
+        <w:t xml:space="preserve">    -&gt; group by deptno</w:t>
+      </w:r>
+    </w:p>
+    <w:p>
+      <w:pPr>
+        <w:rPr>
+          <w:lang w:val="en-US"/>
+        </w:rPr>
+      </w:pPr>
+      <w:r>
+        <w:rPr>
+          <w:lang w:val="en-US"/>
+        </w:rPr>
+        <w:t xml:space="preserve">    -&gt; having deptno = 10</w:t>
+      </w:r>
+    </w:p>
+    <w:p>
+      <w:pPr>
+        <w:rPr>
+          <w:lang w:val="en-US"/>
+        </w:rPr>
+      </w:pPr>
+      <w:r>
+        <w:rPr>
+          <w:lang w:val="en-US"/>
+        </w:rPr>
+        <w:t xml:space="preserve">    -&gt;;</w:t>
+      </w:r>
+    </w:p>
+    <w:p>
+      <w:pPr>
+        <w:numPr>
+          <w:ilvl w:val="0"/>
+          <w:numId w:val="3"/>
+        </w:numPr>
+        <w:rPr>
+          <w:b/>
+          <w:bCs/>
+          <w:lang w:val="en-US"/>
+        </w:rPr>
+      </w:pPr>
+      <w:r>
+        <w:rPr>
+          <w:b/>
+          <w:bCs/>
+          <w:lang w:val="en-US"/>
+        </w:rPr>
+        <w:t>find maximum salary,average sal for each job in every department</w:t>
+      </w:r>
+    </w:p>
+    <w:p>
+      <w:pPr>
+        <w:ind w:left="165"/>
+        <w:rPr>
+          <w:lang w:val="en-US"/>
+        </w:rPr>
+      </w:pPr>
+      <w:r>
+        <w:rPr>
+          <w:lang w:val="en-US"/>
+        </w:rPr>
+        <w:t>Ans. select job,max(sal), round(avg(sal),2)</w:t>
+      </w:r>
+    </w:p>
+    <w:p>
+      <w:pPr>
+        <w:ind w:left="165"/>
+        <w:rPr>
+          <w:lang w:val="en-US"/>
+        </w:rPr>
+      </w:pPr>
+      <w:r>
+        <w:rPr>
+          <w:lang w:val="en-US"/>
+        </w:rPr>
+        <w:t xml:space="preserve">    -&gt; from emp</w:t>
+      </w:r>
+    </w:p>
+    <w:p>
+      <w:pPr>
+        <w:ind w:left="165"/>
+        <w:rPr>
+          <w:lang w:val="en-US"/>
+        </w:rPr>
+      </w:pPr>
+      <w:r>
+        <w:rPr>
+          <w:lang w:val="en-US"/>
+        </w:rPr>
+        <w:t xml:space="preserve">    -&gt; group by job;</w:t>
+      </w:r>
+    </w:p>
+    <w:p>
+      <w:pPr>
+        <w:numPr>
+          <w:ilvl w:val="0"/>
+          <w:numId w:val="3"/>
+        </w:numPr>
+        <w:rPr>
+          <w:b/>
+          <w:bCs/>
+          <w:lang w:val="en-US"/>
+        </w:rPr>
+      </w:pPr>
+      <w:r>
+        <w:rPr>
+          <w:b/>
+          <w:bCs/>
+          <w:lang w:val="en-US"/>
+        </w:rPr>
+        <w:t>find max salary for every department if deptno is &gt; 15 and arrange data in deptno order.</w:t>
+      </w:r>
+    </w:p>
+    <w:p>
+      <w:pPr>
+        <w:ind w:left="165"/>
+        <w:rPr>
+          <w:lang w:val="en-US"/>
+        </w:rPr>
+      </w:pPr>
+      <w:r>
+        <w:rPr>
+          <w:lang w:val="en-US"/>
+        </w:rPr>
+        <w:t>Ans. select deptno,max(sal)</w:t>
+      </w:r>
+    </w:p>
+    <w:p>
+      <w:pPr>
+        <w:ind w:left="165"/>
+        <w:rPr>
+          <w:lang w:val="en-US"/>
+        </w:rPr>
+      </w:pPr>
+      <w:r>
+        <w:rPr>
+          <w:lang w:val="en-US"/>
+        </w:rPr>
+        <w:t xml:space="preserve">    -&gt; from emp</w:t>
+      </w:r>
+    </w:p>
+    <w:p>
+      <w:pPr>
+        <w:ind w:left="165"/>
+        <w:rPr>
+          <w:lang w:val="en-US"/>
+        </w:rPr>
+      </w:pPr>
+      <w:r>
+        <w:rPr>
+          <w:lang w:val="en-US"/>
+        </w:rPr>
+        <w:t xml:space="preserve">    -&gt; group by deptno</w:t>
+      </w:r>
+    </w:p>
+    <w:p>
+      <w:pPr>
+        <w:ind w:left="165"/>
+        <w:rPr>
+          <w:lang w:val="en-US"/>
+        </w:rPr>
+      </w:pPr>
+      <w:r>
+        <w:rPr>
+          <w:lang w:val="en-US"/>
+        </w:rPr>
+        <w:t xml:space="preserve">    -&gt; having deptno &gt; 15</w:t>
+      </w:r>
+    </w:p>
+    <w:p>
+      <w:pPr>
+        <w:ind w:left="165"/>
+        <w:rPr>
+          <w:lang w:val="en-US"/>
+        </w:rPr>
+      </w:pPr>
+      <w:r>
+        <w:rPr>
+          <w:lang w:val="en-US"/>
+        </w:rPr>
+        <w:t xml:space="preserve">    -&gt; order by deptno;</w:t>
+      </w:r>
+    </w:p>
+    <w:p>
+      <w:pPr>
+        <w:numPr>
+          <w:ilvl w:val="0"/>
+          <w:numId w:val="3"/>
+        </w:numPr>
+        <w:rPr>
+          <w:b/>
+          <w:bCs/>
+          <w:lang w:val="en-US"/>
+        </w:rPr>
+      </w:pPr>
+      <w:r>
+        <w:rPr>
+          <w:b/>
+          <w:bCs/>
+          <w:lang w:val="en-US"/>
+        </w:rPr>
+        <w:t>find sum salary for every department if sum is &gt; 3000</w:t>
+      </w:r>
+    </w:p>
+    <w:p>
+      <w:pPr>
+        <w:rPr>
+          <w:lang w:val="en-US"/>
+        </w:rPr>
+      </w:pPr>
+      <w:r>
+        <w:rPr>
+          <w:lang w:val="en-US"/>
+        </w:rPr>
+        <w:t>Ans. select deptno,sum(sal)</w:t>
+      </w:r>
+    </w:p>
+    <w:p>
+      <w:pPr>
+        <w:rPr>
+          <w:lang w:val="en-US"/>
+        </w:rPr>
+      </w:pPr>
+      <w:r>
+        <w:rPr>
+          <w:lang w:val="en-US"/>
+        </w:rPr>
+        <w:t xml:space="preserve">from emp </w:t>
+      </w:r>
+    </w:p>
+    <w:p>
+      <w:pPr>
+        <w:rPr>
+          <w:lang w:val="en-US"/>
+        </w:rPr>
+      </w:pPr>
+      <w:r>
+        <w:rPr>
+          <w:lang w:val="en-US"/>
+        </w:rPr>
+        <w:t>group by deptno</w:t>
+      </w:r>
+    </w:p>
+    <w:p>
+      <w:pPr>
+        <w:rPr>
+          <w:lang w:val="en-US"/>
+        </w:rPr>
+      </w:pPr>
+      <w:r>
+        <w:rPr>
+          <w:lang w:val="en-US"/>
+        </w:rPr>
+        <w:t>having sum(sal) &gt; 3000;</w:t>
+      </w:r>
+    </w:p>
+    <w:p>
+      <w:pPr>
+        <w:ind w:left="165"/>
+        <w:rPr>
+          <w:b/>
+          <w:bCs/>
+          <w:lang w:val="en-US"/>
+        </w:rPr>
+      </w:pPr>
+    </w:p>
+    <w:p>
+      <w:pPr>
+        <w:ind w:left="165"/>
+        <w:rPr>
+          <w:b/>
+          <w:bCs/>
+          <w:lang w:val="en-US"/>
+        </w:rPr>
+      </w:pPr>
+    </w:p>
+    <w:p>
+      <w:pPr>
+        <w:ind w:left="165"/>
+        <w:rPr>
+          <w:b/>
+          <w:bCs/>
+          <w:lang w:val="en-US"/>
+        </w:rPr>
+      </w:pPr>
+    </w:p>
+    <w:p>
+      <w:pPr>
+        <w:ind w:left="165"/>
+        <w:rPr>
+          <w:b/>
+          <w:bCs/>
+          <w:lang w:val="en-US"/>
+        </w:rPr>
+      </w:pPr>
+      <w:r>
+        <w:rPr>
+          <w:b/>
+          <w:bCs/>
+          <w:lang w:val="en-US"/>
+        </w:rPr>
+        <w:t>18.list all department which has minimum 5 employees</w:t>
+      </w:r>
+    </w:p>
+    <w:p>
+      <w:pPr>
+        <w:ind w:left="165"/>
+        <w:rPr>
+          <w:lang w:val="en-US"/>
+        </w:rPr>
+      </w:pPr>
+      <w:r>
+        <w:rPr>
+          <w:lang w:val="en-US"/>
+        </w:rPr>
+        <w:t>Ans. select deptno, dname</w:t>
+      </w:r>
+    </w:p>
+    <w:p>
+      <w:pPr>
+        <w:ind w:left="165"/>
+        <w:rPr>
+          <w:lang w:val="en-US"/>
+        </w:rPr>
+      </w:pPr>
+      <w:r>
+        <w:rPr>
+          <w:lang w:val="en-US"/>
+        </w:rPr>
+        <w:t xml:space="preserve">    -&gt; from dept</w:t>
+      </w:r>
+    </w:p>
+    <w:p>
+      <w:pPr>
+        <w:ind w:left="165"/>
+        <w:rPr>
+          <w:lang w:val="en-US"/>
+        </w:rPr>
+      </w:pPr>
+      <w:r>
+        <w:rPr>
+          <w:lang w:val="en-US"/>
+        </w:rPr>
+        <w:t xml:space="preserve">    -&gt; where deptno in (select deptno</w:t>
+      </w:r>
+    </w:p>
+    <w:p>
+      <w:pPr>
+        <w:ind w:left="165"/>
+        <w:rPr>
+          <w:lang w:val="en-US"/>
+        </w:rPr>
+      </w:pPr>
+      <w:r>
+        <w:rPr>
+          <w:lang w:val="en-US"/>
+        </w:rPr>
+        <w:t xml:space="preserve">    -&gt;  from emp</w:t>
+      </w:r>
+    </w:p>
+    <w:p>
+      <w:pPr>
+        <w:ind w:left="165"/>
+        <w:rPr>
+          <w:lang w:val="en-US"/>
+        </w:rPr>
+      </w:pPr>
+      <w:r>
+        <w:rPr>
+          <w:lang w:val="en-US"/>
+        </w:rPr>
+        <w:t xml:space="preserve">    -&gt;  group by deptno</w:t>
+      </w:r>
+    </w:p>
+    <w:p>
+      <w:pPr>
+        <w:ind w:left="165"/>
+        <w:rPr>
+          <w:lang w:val="en-US"/>
+        </w:rPr>
+      </w:pPr>
+      <w:r>
+        <w:rPr>
+          <w:lang w:val="en-US"/>
+        </w:rPr>
+        <w:t xml:space="preserve">    -&gt;  having count(deptno) &gt; 5);</w:t>
+      </w:r>
+    </w:p>
+    <w:p>
+      <w:pPr>
+        <w:numPr>
+          <w:ilvl w:val="0"/>
+          <w:numId w:val="3"/>
+        </w:numPr>
+        <w:rPr>
+          <w:b/>
+          <w:bCs/>
+          <w:lang w:val="en-US"/>
+        </w:rPr>
+      </w:pPr>
+      <w:r>
+        <w:rPr>
+          <w:b/>
+          <w:bCs/>
+          <w:lang w:val="en-US"/>
+        </w:rPr>
+        <w:t>count how many employees earn salary more than 2000 in each job</w:t>
+      </w:r>
+    </w:p>
+    <w:p>
+      <w:pPr>
+        <w:ind w:left="165"/>
+        <w:rPr>
+          <w:lang w:val="en-US"/>
+        </w:rPr>
+      </w:pPr>
+      <w:r>
+        <w:rPr>
+          <w:b/>
+          <w:bCs/>
+          <w:lang w:val="en-US"/>
+        </w:rPr>
+        <w:t xml:space="preserve">Ans. </w:t>
+      </w:r>
+      <w:r>
+        <w:rPr>
+          <w:lang w:val="en-US"/>
+        </w:rPr>
+        <w:t>select job, count(*)</w:t>
+      </w:r>
+    </w:p>
+    <w:p>
+      <w:pPr>
+        <w:ind w:left="165"/>
+        <w:rPr>
+          <w:lang w:val="en-US"/>
+        </w:rPr>
+      </w:pPr>
+      <w:r>
+        <w:rPr>
+          <w:lang w:val="en-US"/>
+        </w:rPr>
+        <w:t xml:space="preserve">    -&gt; from emp</w:t>
+      </w:r>
+    </w:p>
+    <w:p>
+      <w:pPr>
+        <w:ind w:left="165"/>
+        <w:rPr>
+          <w:lang w:val="en-US"/>
+        </w:rPr>
+      </w:pPr>
+      <w:r>
+        <w:rPr>
+          <w:lang w:val="en-US"/>
+        </w:rPr>
+        <w:t xml:space="preserve">    -&gt; where sal &gt; 2000</w:t>
+      </w:r>
+    </w:p>
+    <w:p>
+      <w:pPr>
+        <w:ind w:left="165"/>
+        <w:rPr>
+          <w:lang w:val="en-US"/>
+        </w:rPr>
+      </w:pPr>
+      <w:r>
+        <w:rPr>
+          <w:lang w:val="en-US"/>
+        </w:rPr>
+        <w:t xml:space="preserve">    -&gt; group by job;</w:t>
+      </w:r>
+    </w:p>
+    <w:p>
+      <w:pPr>
+        <w:numPr>
+          <w:ilvl w:val="0"/>
+          <w:numId w:val="3"/>
+        </w:numPr>
+        <w:rPr>
+          <w:b/>
+          <w:bCs/>
+          <w:lang w:val="en-US"/>
+        </w:rPr>
+      </w:pPr>
+      <w:r>
+        <w:rPr>
+          <w:b/>
+          <w:bCs/>
+          <w:lang w:val="en-US"/>
+        </w:rPr>
+        <w:t>list all enames and jobs in small case letter</w:t>
+      </w:r>
+    </w:p>
+    <w:p>
+      <w:pPr>
+        <w:ind w:left="165"/>
+        <w:rPr>
+          <w:lang w:val="en-US"/>
+        </w:rPr>
+      </w:pPr>
+      <w:r>
+        <w:rPr>
+          <w:lang w:val="en-US"/>
+        </w:rPr>
+        <w:t>Ans. select lower(ename), lower(job)</w:t>
+      </w:r>
+    </w:p>
+    <w:p>
+      <w:pPr>
+        <w:ind w:left="165"/>
+        <w:rPr>
+          <w:lang w:val="en-US"/>
+        </w:rPr>
+      </w:pPr>
+      <w:r>
+        <w:rPr>
+          <w:lang w:val="en-US"/>
+        </w:rPr>
+        <w:t xml:space="preserve">    -&gt; from emp;</w:t>
+      </w:r>
+    </w:p>
+    <w:p>
+      <w:pPr>
+        <w:numPr>
+          <w:ilvl w:val="0"/>
+          <w:numId w:val="3"/>
+        </w:numPr>
+        <w:rPr>
+          <w:lang w:val="en-US"/>
+        </w:rPr>
+      </w:pPr>
+      <w:r>
+        <w:rPr>
+          <w:lang w:val="en-US"/>
+        </w:rPr>
+        <w:t>list all names and jobs so that the length of name should be 15 if it is smaller then add spaces to left</w:t>
+      </w:r>
+    </w:p>
+    <w:p>
+      <w:pPr>
+        <w:ind w:left="525"/>
+        <w:rPr>
+          <w:lang w:val="en-US"/>
+        </w:rPr>
+      </w:pPr>
+      <w:r>
+        <w:rPr>
+          <w:lang w:val="en-US"/>
+        </w:rPr>
+        <w:t>Ans. SELECT LPAD(ename, 15, ' ') AS name, job</w:t>
+      </w:r>
+    </w:p>
+    <w:p>
+      <w:pPr>
+        <w:ind w:left="525"/>
+        <w:rPr>
+          <w:lang w:val="en-US"/>
+        </w:rPr>
+      </w:pPr>
+      <w:r>
+        <w:rPr>
+          <w:lang w:val="en-US"/>
+        </w:rPr>
+        <w:t xml:space="preserve">    -&gt; from emp;</w:t>
+      </w:r>
+    </w:p>
+    <w:p>
+      <w:pPr>
+        <w:numPr>
+          <w:ilvl w:val="0"/>
+          <w:numId w:val="3"/>
+        </w:numPr>
+        <w:rPr>
+          <w:lang w:val="en-US"/>
+        </w:rPr>
+      </w:pPr>
+      <w:r>
+        <w:rPr>
+          <w:lang w:val="en-US"/>
+        </w:rPr>
+        <w:t>display min sal,max sal, average sal for all employees working under same manager</w:t>
+      </w:r>
+    </w:p>
+    <w:p>
+      <w:pPr>
+        <w:ind w:left="525"/>
+        <w:rPr>
+          <w:lang w:val="en-US"/>
+        </w:rPr>
+      </w:pPr>
+      <w:r>
+        <w:rPr>
+          <w:lang w:val="en-US"/>
+        </w:rPr>
+        <w:t>Ans. select min(sal),max(sal),avg(sal),mgr</w:t>
+      </w:r>
+    </w:p>
+    <w:p>
+      <w:pPr>
+        <w:ind w:left="525"/>
+        <w:rPr>
+          <w:lang w:val="en-US"/>
+        </w:rPr>
+      </w:pPr>
+      <w:r>
+        <w:rPr>
+          <w:lang w:val="en-US"/>
+        </w:rPr>
+        <w:t xml:space="preserve">    -&gt; from emp</w:t>
+      </w:r>
+    </w:p>
+    <w:p>
+      <w:pPr>
+        <w:ind w:left="525"/>
+        <w:rPr>
+          <w:lang w:val="en-US"/>
+        </w:rPr>
+      </w:pPr>
+      <w:r>
+        <w:rPr>
+          <w:lang w:val="en-US"/>
+        </w:rPr>
+        <w:t xml:space="preserve">    -&gt; group by mgr;</w:t>
+      </w:r>
+    </w:p>
+    <w:p>
+      <w:pPr>
+        <w:numPr>
+          <w:ilvl w:val="0"/>
+          <w:numId w:val="3"/>
+        </w:numPr>
+        <w:rPr>
+          <w:lang w:val="en-US"/>
+        </w:rPr>
+      </w:pPr>
+      <w:r>
+        <w:rPr>
+          <w:lang w:val="en-US"/>
+        </w:rPr>
+        <w:t>find sum of total earnings(sal+comm), average of sal+comm,</w:t>
+      </w:r>
+    </w:p>
+    <w:p>
+      <w:pPr>
+        <w:rPr>
+          <w:lang w:val="en-US"/>
+        </w:rPr>
+      </w:pPr>
+      <w:r>
+        <w:rPr>
+          <w:lang w:val="en-US"/>
+        </w:rPr>
+        <w:t>for all employees who earn sal &gt; 2000 and work in either dept no 10 or 20</w:t>
+      </w:r>
+    </w:p>
+    <w:p>
+      <w:pPr>
+        <w:rPr>
+          <w:lang w:val="en-US"/>
+        </w:rPr>
+      </w:pPr>
+      <w:r>
+        <w:rPr>
+          <w:lang w:val="en-US"/>
+        </w:rPr>
+        <w:t>Ans. select sum(ifnull(sal,0)+ifnull(comm,0)) 'total sal', avg(ifnull(sal,0)+ifnull(comm,0)) 'avg sal'</w:t>
+      </w:r>
+    </w:p>
+    <w:p>
+      <w:pPr>
+        <w:rPr>
+          <w:lang w:val="en-US"/>
+        </w:rPr>
+      </w:pPr>
+      <w:r>
+        <w:rPr>
+          <w:lang w:val="en-US"/>
+        </w:rPr>
+        <w:t xml:space="preserve">    -&gt; from emp</w:t>
+      </w:r>
+    </w:p>
+    <w:p>
+      <w:pPr>
+        <w:rPr>
+          <w:lang w:val="en-US"/>
+        </w:rPr>
+      </w:pPr>
+      <w:r>
+        <w:rPr>
+          <w:lang w:val="en-US"/>
+        </w:rPr>
+        <w:t xml:space="preserve">    -&gt; where sal &gt; 2000 and deptno in(10,20);</w:t>
+      </w:r>
+    </w:p>
+    <w:p>
+      <w:pPr>
+        <w:numPr>
+          <w:ilvl w:val="0"/>
+          <w:numId w:val="3"/>
+        </w:numPr>
+        <w:rPr>
+          <w:lang w:val="en-US"/>
+        </w:rPr>
+      </w:pPr>
+      <w:r>
+        <w:rPr>
+          <w:lang w:val="en-US"/>
+        </w:rPr>
+        <w:t>list all employees who joined in Aug 1980 and salary is &gt;1500 and &lt; 2500</w:t>
+      </w:r>
+    </w:p>
+    <w:p>
+      <w:pPr>
+        <w:ind w:left="525"/>
+        <w:rPr>
+          <w:lang w:val="en-US"/>
+        </w:rPr>
+      </w:pPr>
+      <w:r>
+        <w:rPr>
+          <w:lang w:val="en-US"/>
+        </w:rPr>
+        <w:t>Ans. select *</w:t>
+      </w:r>
+    </w:p>
+    <w:p>
+      <w:pPr>
+        <w:ind w:left="525"/>
+        <w:rPr>
+          <w:lang w:val="en-US"/>
+        </w:rPr>
+      </w:pPr>
+      <w:r>
+        <w:rPr>
+          <w:lang w:val="en-US"/>
+        </w:rPr>
+        <w:t xml:space="preserve">    -&gt; from emp</w:t>
+      </w:r>
+    </w:p>
+    <w:p>
+      <w:pPr>
+        <w:ind w:left="525"/>
+        <w:rPr>
+          <w:lang w:val="en-US"/>
+        </w:rPr>
+      </w:pPr>
+      <w:r>
+        <w:rPr>
+          <w:lang w:val="en-US"/>
+        </w:rPr>
+        <w:t xml:space="preserve">    -&gt; where hiredate between '1980-08-01' and '1980-08-31' and  sal between 1500 and 2500;</w:t>
+      </w:r>
+    </w:p>
+    <w:p>
+      <w:pPr>
+        <w:numPr>
+          <w:ilvl w:val="0"/>
+          <w:numId w:val="3"/>
+        </w:numPr>
+        <w:rPr>
+          <w:lang w:val="en-US"/>
+        </w:rPr>
+      </w:pPr>
+      <w:r>
+        <w:rPr>
+          <w:lang w:val="en-US"/>
+        </w:rPr>
+        <w:t>list all employees joined in either aug or may or dec</w:t>
+      </w:r>
+    </w:p>
+    <w:p>
+      <w:pPr>
+        <w:ind w:left="525"/>
+        <w:rPr>
+          <w:lang w:val="en-US"/>
+        </w:rPr>
+      </w:pPr>
+      <w:r>
+        <w:rPr>
+          <w:lang w:val="en-US"/>
+        </w:rPr>
+        <w:t>Ans. select *</w:t>
+      </w:r>
+    </w:p>
+    <w:p>
+      <w:pPr>
+        <w:ind w:left="525"/>
+        <w:rPr>
+          <w:lang w:val="en-US"/>
+        </w:rPr>
+      </w:pPr>
+      <w:r>
+        <w:rPr>
+          <w:lang w:val="en-US"/>
+        </w:rPr>
+        <w:t xml:space="preserve">    -&gt; from emp</w:t>
+      </w:r>
+    </w:p>
+    <w:p>
+      <w:pPr>
+        <w:ind w:left="525"/>
+        <w:rPr>
+          <w:lang w:val="en-US"/>
+        </w:rPr>
+      </w:pPr>
+      <w:r>
+        <w:rPr>
+          <w:lang w:val="en-US"/>
+        </w:rPr>
+        <w:t xml:space="preserve">    -&gt; where month(hiredate) in (5,8,12);</w:t>
+      </w:r>
+    </w:p>
+    <w:p>
+      <w:pPr>
+        <w:numPr>
+          <w:ilvl w:val="0"/>
+          <w:numId w:val="3"/>
+        </w:numPr>
+        <w:rPr>
+          <w:lang w:val="en-US"/>
+        </w:rPr>
+      </w:pPr>
+      <w:r>
+        <w:rPr>
+          <w:lang w:val="en-US"/>
+        </w:rPr>
+        <w:t>display name and hiredate in dd/mm/yy format for all employees whose job is clerk and they earn some commission</w:t>
+      </w:r>
+    </w:p>
+    <w:p>
+      <w:pPr>
+        <w:ind w:left="525"/>
+        <w:rPr>
+          <w:lang w:val="en-US"/>
+        </w:rPr>
+      </w:pPr>
+      <w:r>
+        <w:rPr>
+          <w:lang w:val="en-US"/>
+        </w:rPr>
+        <w:t>Ans               select ename , date_format(hiredate, '%d/%m/%y')</w:t>
+      </w:r>
+    </w:p>
+    <w:p>
+      <w:pPr>
+        <w:ind w:left="525"/>
+        <w:rPr>
+          <w:lang w:val="en-US"/>
+        </w:rPr>
+      </w:pPr>
+      <w:r>
+        <w:rPr>
+          <w:lang w:val="en-US"/>
+        </w:rPr>
+        <w:t xml:space="preserve">    -&gt; from emp</w:t>
+      </w:r>
+    </w:p>
+    <w:p>
+      <w:pPr>
+        <w:ind w:left="525"/>
+        <w:rPr>
+          <w:lang w:val="en-US"/>
         </w:rPr>
         <w:sectPr>
-          <w:type w:val="continuous"/>
           <w:pgSz w:w="11910" w:h="16840"/>
           <w:pgMar w:top="1840" w:right="1417" w:bottom="280" w:left="1417" w:header="720" w:footer="720" w:gutter="0"/>
           <w:cols w:space="720" w:num="1"/>
         </w:sectPr>
       </w:pPr>
+      <w:r>
+        <w:rPr>
+          <w:lang w:val="en-US"/>
+        </w:rPr>
+        <w:t xml:space="preserve">    -&gt; where job = 'clerk' and comm is not null</w:t>
+      </w:r>
     </w:p>
     <w:p>
       <w:pPr>
@@ -6838,12 +5272,14 @@
           <w:tab w:val="left" w:pos="525"/>
         </w:tabs>
         <w:spacing w:before="41" w:after="0" w:line="259" w:lineRule="auto"/>
-        <w:ind w:left="525" w:right="398" w:hanging="360"/>
-        <w:jc w:val="left"/>
-        <w:rPr>
-          <w:sz w:val="22"/>
-        </w:rPr>
-      </w:pPr>
+        <w:ind w:left="360" w:leftChars="0" w:right="398" w:hanging="360" w:firstLineChars="0"/>
+        <w:jc w:val="left"/>
+        <w:rPr>
+          <w:sz w:val="22"/>
+        </w:rPr>
+      </w:pPr>
+      <w:bookmarkStart w:id="0" w:name="_GoBack"/>
+      <w:bookmarkEnd w:id="0"/>
       <w:r>
         <w:rPr>
           <w:sz w:val="22"/>
@@ -7143,7 +5579,7 @@
           <w:tab w:val="left" w:pos="525"/>
         </w:tabs>
         <w:spacing w:before="1" w:after="0" w:line="256" w:lineRule="auto"/>
-        <w:ind w:left="525" w:right="256" w:hanging="360"/>
+        <w:ind w:left="360" w:leftChars="0" w:right="256" w:hanging="360" w:firstLineChars="0"/>
         <w:jc w:val="left"/>
         <w:rPr>
           <w:sz w:val="22"/>
@@ -7476,7 +5912,7 @@
           <w:tab w:val="left" w:pos="1463"/>
         </w:tabs>
         <w:spacing w:before="0" w:after="0" w:line="403" w:lineRule="auto"/>
-        <w:ind w:left="1463" w:right="1120" w:hanging="1299"/>
+        <w:ind w:left="1298" w:leftChars="0" w:right="1120" w:hanging="1299" w:firstLineChars="0"/>
         <w:jc w:val="left"/>
         <w:rPr>
           <w:sz w:val="22"/>
@@ -7735,7 +6171,7 @@
           <w:tab w:val="left" w:pos="2183"/>
         </w:tabs>
         <w:spacing w:before="1" w:after="0" w:line="400" w:lineRule="auto"/>
-        <w:ind w:left="2183" w:right="1162" w:hanging="2019"/>
+        <w:ind w:left="2018" w:leftChars="0" w:right="1162" w:hanging="2019" w:firstLineChars="0"/>
         <w:jc w:val="left"/>
         <w:rPr>
           <w:sz w:val="22"/>
@@ -8246,7 +6682,7 @@
           <w:tab w:val="left" w:pos="525"/>
         </w:tabs>
         <w:spacing w:before="0" w:after="0" w:line="259" w:lineRule="auto"/>
-        <w:ind w:left="525" w:right="5584" w:hanging="360"/>
+        <w:ind w:left="360" w:leftChars="0" w:right="5584" w:hanging="360" w:firstLineChars="0"/>
         <w:jc w:val="left"/>
         <w:rPr>
           <w:sz w:val="22"/>
@@ -8800,7 +7236,7 @@
           <w:tab w:val="left" w:pos="523"/>
         </w:tabs>
         <w:spacing w:before="41" w:after="0" w:line="240" w:lineRule="auto"/>
-        <w:ind w:left="523" w:right="0" w:hanging="358"/>
+        <w:ind w:left="358" w:leftChars="0" w:right="0" w:hanging="358" w:firstLineChars="0"/>
         <w:jc w:val="left"/>
         <w:rPr>
           <w:sz w:val="22"/>
@@ -9669,7 +8105,7 @@
           <w:tab w:val="left" w:pos="523"/>
         </w:tabs>
         <w:spacing w:before="181" w:after="0" w:line="240" w:lineRule="auto"/>
-        <w:ind w:left="523" w:right="0" w:hanging="358"/>
+        <w:ind w:left="358" w:leftChars="0" w:right="0" w:hanging="358" w:firstLineChars="0"/>
         <w:jc w:val="left"/>
         <w:rPr>
           <w:sz w:val="22"/>
@@ -9899,7 +8335,7 @@
           <w:tab w:val="left" w:pos="523"/>
         </w:tabs>
         <w:spacing w:before="1" w:after="0" w:line="240" w:lineRule="auto"/>
-        <w:ind w:left="523" w:right="0" w:hanging="358"/>
+        <w:ind w:left="358" w:leftChars="0" w:right="0" w:hanging="358" w:firstLineChars="0"/>
         <w:jc w:val="left"/>
         <w:rPr>
           <w:sz w:val="22"/>
@@ -10632,7 +9068,7 @@
           <w:tab w:val="left" w:leader="hyphen" w:pos="2783"/>
         </w:tabs>
         <w:spacing w:before="0" w:after="0" w:line="240" w:lineRule="auto"/>
-        <w:ind w:left="523" w:right="0" w:hanging="358"/>
+        <w:ind w:left="358" w:leftChars="0" w:right="0" w:hanging="358" w:firstLineChars="0"/>
         <w:jc w:val="left"/>
         <w:rPr>
           <w:sz w:val="22"/>
@@ -11076,7 +9512,7 @@
           <w:tab w:val="left" w:pos="523"/>
         </w:tabs>
         <w:spacing w:before="19" w:after="0" w:line="240" w:lineRule="auto"/>
-        <w:ind w:left="523" w:right="0" w:hanging="358"/>
+        <w:ind w:left="358" w:leftChars="0" w:right="0" w:hanging="358" w:firstLineChars="0"/>
         <w:jc w:val="left"/>
         <w:rPr>
           <w:sz w:val="22"/>
@@ -11230,7 +9666,7 @@
           <w:tab w:val="left" w:pos="523"/>
         </w:tabs>
         <w:spacing w:before="0" w:after="0" w:line="240" w:lineRule="auto"/>
-        <w:ind w:left="523" w:right="0" w:hanging="358"/>
+        <w:ind w:left="358" w:leftChars="0" w:right="0" w:hanging="358" w:firstLineChars="0"/>
         <w:jc w:val="left"/>
         <w:rPr>
           <w:sz w:val="22"/>
@@ -11515,7 +9951,7 @@
           <w:tab w:val="left" w:pos="523"/>
         </w:tabs>
         <w:spacing w:before="22" w:after="0" w:line="240" w:lineRule="auto"/>
-        <w:ind w:left="523" w:right="0" w:hanging="358"/>
+        <w:ind w:left="358" w:leftChars="0" w:right="0" w:hanging="358" w:firstLineChars="0"/>
         <w:jc w:val="left"/>
         <w:rPr>
           <w:sz w:val="22"/>
@@ -11716,7 +10152,7 @@
           <w:tab w:val="left" w:pos="523"/>
         </w:tabs>
         <w:spacing w:before="22" w:after="0" w:line="240" w:lineRule="auto"/>
-        <w:ind w:left="523" w:right="0" w:hanging="358"/>
+        <w:ind w:left="358" w:leftChars="0" w:right="0" w:hanging="358" w:firstLineChars="0"/>
         <w:jc w:val="left"/>
         <w:rPr>
           <w:sz w:val="22"/>
@@ -11949,7 +10385,7 @@
           <w:tab w:val="left" w:pos="523"/>
         </w:tabs>
         <w:spacing w:before="22" w:after="0" w:line="240" w:lineRule="auto"/>
-        <w:ind w:left="523" w:right="0" w:hanging="358"/>
+        <w:ind w:left="358" w:leftChars="0" w:right="0" w:hanging="358" w:firstLineChars="0"/>
         <w:jc w:val="left"/>
         <w:rPr>
           <w:sz w:val="22"/>
@@ -12301,7 +10737,7 @@
           <w:tab w:val="left" w:pos="523"/>
         </w:tabs>
         <w:spacing w:before="19" w:after="0" w:line="240" w:lineRule="auto"/>
-        <w:ind w:left="523" w:right="0" w:hanging="358"/>
+        <w:ind w:left="358" w:leftChars="0" w:right="0" w:hanging="358" w:firstLineChars="0"/>
         <w:jc w:val="left"/>
         <w:rPr>
           <w:sz w:val="22"/>
@@ -12485,7 +10921,7 @@
           <w:tab w:val="left" w:pos="523"/>
         </w:tabs>
         <w:spacing w:before="22" w:after="0" w:line="240" w:lineRule="auto"/>
-        <w:ind w:left="523" w:right="0" w:hanging="358"/>
+        <w:ind w:left="358" w:leftChars="0" w:right="0" w:hanging="358" w:firstLineChars="0"/>
         <w:jc w:val="left"/>
         <w:rPr>
           <w:sz w:val="22"/>
@@ -12694,7 +11130,7 @@
           <w:tab w:val="left" w:pos="523"/>
         </w:tabs>
         <w:spacing w:before="22" w:after="0" w:line="240" w:lineRule="auto"/>
-        <w:ind w:left="523" w:right="0" w:hanging="358"/>
+        <w:ind w:left="358" w:leftChars="0" w:right="0" w:hanging="358" w:firstLineChars="0"/>
         <w:jc w:val="left"/>
         <w:rPr>
           <w:sz w:val="22"/>
@@ -13012,7 +11448,7 @@
           <w:tab w:val="left" w:pos="523"/>
         </w:tabs>
         <w:spacing w:before="22" w:after="0" w:line="240" w:lineRule="auto"/>
-        <w:ind w:left="523" w:right="0" w:hanging="358"/>
+        <w:ind w:left="358" w:leftChars="0" w:right="0" w:hanging="358" w:firstLineChars="0"/>
         <w:jc w:val="left"/>
         <w:rPr>
           <w:sz w:val="22"/>
@@ -13291,7 +11727,7 @@
           <w:tab w:val="left" w:pos="523"/>
         </w:tabs>
         <w:spacing w:before="19" w:after="0" w:line="240" w:lineRule="auto"/>
-        <w:ind w:left="523" w:right="0" w:hanging="358"/>
+        <w:ind w:left="358" w:leftChars="0" w:right="0" w:hanging="358" w:firstLineChars="0"/>
         <w:jc w:val="left"/>
         <w:rPr>
           <w:sz w:val="22"/>
@@ -13540,7 +11976,7 @@
           <w:tab w:val="left" w:pos="523"/>
         </w:tabs>
         <w:spacing w:before="22" w:after="0" w:line="240" w:lineRule="auto"/>
-        <w:ind w:left="523" w:right="0" w:hanging="358"/>
+        <w:ind w:left="358" w:leftChars="0" w:right="0" w:hanging="358" w:firstLineChars="0"/>
         <w:jc w:val="left"/>
         <w:rPr>
           <w:sz w:val="22"/>
@@ -13782,7 +12218,7 @@
           <w:tab w:val="left" w:pos="523"/>
         </w:tabs>
         <w:spacing w:before="22" w:after="0" w:line="240" w:lineRule="auto"/>
-        <w:ind w:left="523" w:right="0" w:hanging="358"/>
+        <w:ind w:left="358" w:leftChars="0" w:right="0" w:hanging="358" w:firstLineChars="0"/>
         <w:jc w:val="left"/>
         <w:rPr>
           <w:rFonts w:hint="default"/>
@@ -14054,7 +12490,7 @@
           <w:tab w:val="left" w:pos="523"/>
         </w:tabs>
         <w:spacing w:before="22" w:after="0" w:line="240" w:lineRule="auto"/>
-        <w:ind w:left="523" w:right="0" w:hanging="358"/>
+        <w:ind w:left="358" w:leftChars="0" w:right="0" w:hanging="358" w:firstLineChars="0"/>
         <w:jc w:val="left"/>
         <w:rPr>
           <w:sz w:val="22"/>
@@ -14436,7 +12872,7 @@
           <w:tab w:val="left" w:pos="523"/>
         </w:tabs>
         <w:spacing w:before="20" w:after="0" w:line="240" w:lineRule="auto"/>
-        <w:ind w:left="523" w:right="0" w:hanging="358"/>
+        <w:ind w:left="358" w:leftChars="0" w:right="0" w:hanging="358" w:firstLineChars="0"/>
         <w:jc w:val="left"/>
         <w:rPr>
           <w:sz w:val="22"/>
@@ -14875,7 +13311,7 @@
           <w:tab w:val="left" w:pos="523"/>
         </w:tabs>
         <w:spacing w:before="22" w:after="0" w:line="240" w:lineRule="auto"/>
-        <w:ind w:left="523" w:right="0" w:hanging="358"/>
+        <w:ind w:left="358" w:leftChars="0" w:right="0" w:hanging="358" w:firstLineChars="0"/>
         <w:jc w:val="left"/>
         <w:rPr>
           <w:sz w:val="22"/>
@@ -15242,7 +13678,7 @@
           <w:tab w:val="left" w:pos="523"/>
         </w:tabs>
         <w:spacing w:before="21" w:after="0" w:line="240" w:lineRule="auto"/>
-        <w:ind w:left="523" w:right="0" w:hanging="358"/>
+        <w:ind w:left="358" w:leftChars="0" w:right="0" w:hanging="358" w:firstLineChars="0"/>
         <w:jc w:val="left"/>
         <w:rPr>
           <w:sz w:val="22"/>
@@ -15520,7 +13956,7 @@
           <w:tab w:val="left" w:pos="523"/>
         </w:tabs>
         <w:spacing w:before="22" w:after="0" w:line="240" w:lineRule="auto"/>
-        <w:ind w:left="523" w:right="0" w:hanging="358"/>
+        <w:ind w:left="358" w:leftChars="0" w:right="0" w:hanging="358" w:firstLineChars="0"/>
         <w:jc w:val="left"/>
         <w:rPr>
           <w:sz w:val="22"/>
@@ -15942,7 +14378,7 @@
           <w:tab w:val="left" w:pos="523"/>
         </w:tabs>
         <w:spacing w:before="20" w:after="0" w:line="240" w:lineRule="auto"/>
-        <w:ind w:left="523" w:right="0" w:hanging="358"/>
+        <w:ind w:left="358" w:leftChars="0" w:right="0" w:hanging="358" w:firstLineChars="0"/>
         <w:jc w:val="left"/>
         <w:rPr>
           <w:sz w:val="22"/>
@@ -16051,6 +14487,7 @@
       <w:pPr>
         <w:pStyle w:val="6"/>
         <w:numPr>
+          <w:ilvl w:val="0"/>
           <w:numId w:val="0"/>
         </w:numPr>
         <w:tabs>
@@ -16080,6 +14517,7 @@
       <w:pPr>
         <w:pStyle w:val="6"/>
         <w:numPr>
+          <w:ilvl w:val="0"/>
           <w:numId w:val="0"/>
         </w:numPr>
         <w:tabs>
@@ -16109,6 +14547,7 @@
       <w:pPr>
         <w:pStyle w:val="6"/>
         <w:numPr>
+          <w:ilvl w:val="0"/>
           <w:numId w:val="0"/>
         </w:numPr>
         <w:tabs>
@@ -16138,6 +14577,7 @@
       <w:pPr>
         <w:pStyle w:val="6"/>
         <w:numPr>
+          <w:ilvl w:val="0"/>
           <w:numId w:val="0"/>
         </w:numPr>
         <w:tabs>
@@ -16167,6 +14607,7 @@
       <w:pPr>
         <w:pStyle w:val="6"/>
         <w:numPr>
+          <w:ilvl w:val="0"/>
           <w:numId w:val="0"/>
         </w:numPr>
         <w:tabs>
@@ -16196,6 +14637,7 @@
       <w:pPr>
         <w:pStyle w:val="6"/>
         <w:numPr>
+          <w:ilvl w:val="0"/>
           <w:numId w:val="0"/>
         </w:numPr>
         <w:tabs>
@@ -16232,7 +14674,7 @@
           <w:tab w:val="left" w:pos="743"/>
         </w:tabs>
         <w:spacing w:before="22" w:after="0" w:line="259" w:lineRule="auto"/>
-        <w:ind w:left="743" w:right="611" w:hanging="579"/>
+        <w:ind w:left="578" w:leftChars="0" w:right="611" w:hanging="579" w:firstLineChars="0"/>
         <w:jc w:val="left"/>
         <w:rPr>
           <w:sz w:val="22"/>
@@ -17177,6 +15619,7 @@
       <w:pPr>
         <w:pStyle w:val="6"/>
         <w:numPr>
+          <w:ilvl w:val="0"/>
           <w:numId w:val="0"/>
         </w:numPr>
         <w:tabs>
@@ -17206,6 +15649,7 @@
       <w:pPr>
         <w:pStyle w:val="6"/>
         <w:numPr>
+          <w:ilvl w:val="0"/>
           <w:numId w:val="0"/>
         </w:numPr>
         <w:tabs>
@@ -17235,6 +15679,7 @@
       <w:pPr>
         <w:pStyle w:val="6"/>
         <w:numPr>
+          <w:ilvl w:val="0"/>
           <w:numId w:val="0"/>
         </w:numPr>
         <w:tabs>
@@ -17264,6 +15709,7 @@
       <w:pPr>
         <w:pStyle w:val="6"/>
         <w:numPr>
+          <w:ilvl w:val="0"/>
           <w:numId w:val="0"/>
         </w:numPr>
         <w:tabs>
@@ -17293,6 +15739,7 @@
       <w:pPr>
         <w:pStyle w:val="6"/>
         <w:numPr>
+          <w:ilvl w:val="0"/>
           <w:numId w:val="0"/>
         </w:numPr>
         <w:tabs>
@@ -17322,6 +15769,7 @@
       <w:pPr>
         <w:pStyle w:val="6"/>
         <w:numPr>
+          <w:ilvl w:val="0"/>
           <w:numId w:val="0"/>
         </w:numPr>
         <w:tabs>
@@ -17351,6 +15799,7 @@
       <w:pPr>
         <w:pStyle w:val="6"/>
         <w:numPr>
+          <w:ilvl w:val="0"/>
           <w:numId w:val="0"/>
         </w:numPr>
         <w:tabs>
@@ -17380,6 +15829,7 @@
       <w:pPr>
         <w:pStyle w:val="6"/>
         <w:numPr>
+          <w:ilvl w:val="0"/>
           <w:numId w:val="0"/>
         </w:numPr>
         <w:tabs>
@@ -17409,6 +15859,7 @@
       <w:pPr>
         <w:pStyle w:val="6"/>
         <w:numPr>
+          <w:ilvl w:val="0"/>
           <w:numId w:val="0"/>
         </w:numPr>
         <w:tabs>
@@ -17438,6 +15889,7 @@
       <w:pPr>
         <w:pStyle w:val="6"/>
         <w:numPr>
+          <w:ilvl w:val="0"/>
           <w:numId w:val="0"/>
         </w:numPr>
         <w:tabs>
@@ -17509,15 +15961,7 @@
         <w:rPr>
           <w:sz w:val="22"/>
         </w:rPr>
-        <w:t>prod</w:t>
-      </w:r>
-      <w:bookmarkStart w:id="0" w:name="_GoBack"/>
-      <w:bookmarkEnd w:id="0"/>
-      <w:r>
-        <w:rPr>
-          <w:sz w:val="22"/>
-        </w:rPr>
-        <w:t>uct</w:t>
+        <w:t>product</w:t>
       </w:r>
       <w:r>
         <w:rPr>
@@ -17668,6 +16112,7 @@
       <w:pPr>
         <w:pStyle w:val="6"/>
         <w:numPr>
+          <w:ilvl w:val="0"/>
           <w:numId w:val="0"/>
         </w:numPr>
         <w:tabs>
@@ -17697,6 +16142,7 @@
       <w:pPr>
         <w:pStyle w:val="6"/>
         <w:numPr>
+          <w:ilvl w:val="0"/>
           <w:numId w:val="0"/>
         </w:numPr>
         <w:tabs>
@@ -17726,6 +16172,7 @@
       <w:pPr>
         <w:pStyle w:val="6"/>
         <w:numPr>
+          <w:ilvl w:val="0"/>
           <w:numId w:val="0"/>
         </w:numPr>
         <w:tabs>
@@ -17755,6 +16202,7 @@
       <w:pPr>
         <w:pStyle w:val="6"/>
         <w:numPr>
+          <w:ilvl w:val="0"/>
           <w:numId w:val="0"/>
         </w:numPr>
         <w:tabs>
@@ -17784,6 +16232,7 @@
       <w:pPr>
         <w:pStyle w:val="6"/>
         <w:numPr>
+          <w:ilvl w:val="0"/>
           <w:numId w:val="0"/>
         </w:numPr>
         <w:tabs>
@@ -17813,6 +16262,7 @@
       <w:pPr>
         <w:pStyle w:val="6"/>
         <w:numPr>
+          <w:ilvl w:val="0"/>
           <w:numId w:val="0"/>
         </w:numPr>
         <w:tabs>
@@ -17842,6 +16292,7 @@
       <w:pPr>
         <w:pStyle w:val="6"/>
         <w:numPr>
+          <w:ilvl w:val="0"/>
           <w:numId w:val="0"/>
         </w:numPr>
         <w:tabs>
@@ -18129,7 +16580,7 @@
           <w:tab w:val="left" w:pos="743"/>
         </w:tabs>
         <w:spacing w:before="41" w:after="0" w:line="259" w:lineRule="auto"/>
-        <w:ind w:left="743" w:right="613" w:hanging="579"/>
+        <w:ind w:left="578" w:leftChars="0" w:right="613" w:hanging="579" w:firstLineChars="0"/>
         <w:jc w:val="left"/>
         <w:rPr>
           <w:sz w:val="22"/>
@@ -18447,7 +16898,7 @@
         <w:pStyle w:val="6"/>
         <w:numPr>
           <w:ilvl w:val="0"/>
-          <w:numId w:val="3"/>
+          <w:numId w:val="4"/>
         </w:numPr>
         <w:tabs>
           <w:tab w:val="left" w:pos="1836"/>
@@ -18499,7 +16950,7 @@
         <w:pStyle w:val="6"/>
         <w:numPr>
           <w:ilvl w:val="0"/>
-          <w:numId w:val="3"/>
+          <w:numId w:val="4"/>
         </w:numPr>
         <w:tabs>
           <w:tab w:val="left" w:pos="1836"/>
@@ -18552,7 +17003,7 @@
         <w:pStyle w:val="6"/>
         <w:numPr>
           <w:ilvl w:val="0"/>
-          <w:numId w:val="3"/>
+          <w:numId w:val="4"/>
         </w:numPr>
         <w:tabs>
           <w:tab w:val="left" w:pos="1885"/>
@@ -18605,7 +17056,7 @@
         <w:pStyle w:val="6"/>
         <w:numPr>
           <w:ilvl w:val="0"/>
-          <w:numId w:val="3"/>
+          <w:numId w:val="4"/>
         </w:numPr>
         <w:tabs>
           <w:tab w:val="left" w:pos="1836"/>
@@ -19308,7 +17759,7 @@
         <w:pStyle w:val="6"/>
         <w:numPr>
           <w:ilvl w:val="0"/>
-          <w:numId w:val="4"/>
+          <w:numId w:val="5"/>
         </w:numPr>
         <w:tabs>
           <w:tab w:val="left" w:pos="2181"/>
@@ -19524,7 +17975,7 @@
         <w:pStyle w:val="6"/>
         <w:numPr>
           <w:ilvl w:val="0"/>
-          <w:numId w:val="4"/>
+          <w:numId w:val="5"/>
         </w:numPr>
         <w:tabs>
           <w:tab w:val="left" w:pos="2181"/>
@@ -19731,7 +18182,7 @@
         <w:pStyle w:val="6"/>
         <w:numPr>
           <w:ilvl w:val="0"/>
-          <w:numId w:val="4"/>
+          <w:numId w:val="5"/>
         </w:numPr>
         <w:tabs>
           <w:tab w:val="left" w:pos="2181"/>
@@ -19905,7 +18356,7 @@
         <w:pStyle w:val="6"/>
         <w:numPr>
           <w:ilvl w:val="0"/>
-          <w:numId w:val="4"/>
+          <w:numId w:val="5"/>
         </w:numPr>
         <w:tabs>
           <w:tab w:val="left" w:pos="2181"/>
@@ -20047,7 +18498,7 @@
         <w:pStyle w:val="6"/>
         <w:numPr>
           <w:ilvl w:val="0"/>
-          <w:numId w:val="4"/>
+          <w:numId w:val="5"/>
         </w:numPr>
         <w:tabs>
           <w:tab w:val="left" w:pos="2181"/>
@@ -20222,7 +18673,7 @@
         <w:pStyle w:val="6"/>
         <w:numPr>
           <w:ilvl w:val="0"/>
-          <w:numId w:val="4"/>
+          <w:numId w:val="5"/>
         </w:numPr>
         <w:tabs>
           <w:tab w:val="left" w:pos="2181"/>
@@ -20416,7 +18867,7 @@
           <w:tab w:val="left" w:pos="523"/>
         </w:tabs>
         <w:spacing w:before="4" w:after="0" w:line="240" w:lineRule="auto"/>
-        <w:ind w:left="523" w:right="0" w:hanging="358"/>
+        <w:ind w:left="358" w:leftChars="0" w:right="0" w:hanging="358" w:firstLineChars="0"/>
         <w:jc w:val="left"/>
         <w:rPr>
           <w:sz w:val="22"/>
@@ -21578,7 +20029,7 @@
         <w:pStyle w:val="6"/>
         <w:numPr>
           <w:ilvl w:val="0"/>
-          <w:numId w:val="5"/>
+          <w:numId w:val="6"/>
         </w:numPr>
         <w:tabs>
           <w:tab w:val="left" w:pos="1935"/>
@@ -21616,7 +20067,7 @@
         <w:pStyle w:val="6"/>
         <w:numPr>
           <w:ilvl w:val="0"/>
-          <w:numId w:val="5"/>
+          <w:numId w:val="6"/>
         </w:numPr>
         <w:tabs>
           <w:tab w:val="left" w:pos="1935"/>
@@ -21654,7 +20105,7 @@
         <w:pStyle w:val="6"/>
         <w:numPr>
           <w:ilvl w:val="0"/>
-          <w:numId w:val="5"/>
+          <w:numId w:val="6"/>
         </w:numPr>
         <w:tabs>
           <w:tab w:val="left" w:pos="1935"/>
@@ -21693,7 +20144,7 @@
         <w:pStyle w:val="6"/>
         <w:numPr>
           <w:ilvl w:val="0"/>
-          <w:numId w:val="5"/>
+          <w:numId w:val="6"/>
         </w:numPr>
         <w:tabs>
           <w:tab w:val="left" w:pos="1937"/>
@@ -21829,7 +20280,7 @@
         <w:pStyle w:val="6"/>
         <w:numPr>
           <w:ilvl w:val="0"/>
-          <w:numId w:val="6"/>
+          <w:numId w:val="7"/>
         </w:numPr>
         <w:tabs>
           <w:tab w:val="left" w:pos="1825"/>
@@ -21881,7 +20332,7 @@
         <w:pStyle w:val="6"/>
         <w:numPr>
           <w:ilvl w:val="0"/>
-          <w:numId w:val="6"/>
+          <w:numId w:val="7"/>
         </w:numPr>
         <w:tabs>
           <w:tab w:val="left" w:pos="1825"/>
@@ -21932,7 +20383,7 @@
         <w:pStyle w:val="6"/>
         <w:numPr>
           <w:ilvl w:val="0"/>
-          <w:numId w:val="6"/>
+          <w:numId w:val="7"/>
         </w:numPr>
         <w:tabs>
           <w:tab w:val="left" w:pos="1825"/>
@@ -21971,7 +20422,7 @@
         <w:pStyle w:val="6"/>
         <w:numPr>
           <w:ilvl w:val="0"/>
-          <w:numId w:val="6"/>
+          <w:numId w:val="7"/>
         </w:numPr>
         <w:tabs>
           <w:tab w:val="left" w:pos="1825"/>
@@ -22061,7 +20512,7 @@
         <w:pStyle w:val="6"/>
         <w:numPr>
           <w:ilvl w:val="0"/>
-          <w:numId w:val="7"/>
+          <w:numId w:val="8"/>
         </w:numPr>
         <w:tabs>
           <w:tab w:val="left" w:pos="741"/>
@@ -22144,7 +20595,7 @@
         <w:pStyle w:val="6"/>
         <w:numPr>
           <w:ilvl w:val="0"/>
-          <w:numId w:val="7"/>
+          <w:numId w:val="8"/>
         </w:numPr>
         <w:tabs>
           <w:tab w:val="left" w:pos="741"/>
@@ -22234,7 +20685,7 @@
         <w:pStyle w:val="6"/>
         <w:numPr>
           <w:ilvl w:val="0"/>
-          <w:numId w:val="7"/>
+          <w:numId w:val="8"/>
         </w:numPr>
         <w:tabs>
           <w:tab w:val="left" w:pos="741"/>
@@ -22363,7 +20814,7 @@
         <w:pStyle w:val="6"/>
         <w:numPr>
           <w:ilvl w:val="0"/>
-          <w:numId w:val="7"/>
+          <w:numId w:val="8"/>
         </w:numPr>
         <w:tabs>
           <w:tab w:val="left" w:pos="741"/>
@@ -22507,7 +20958,7 @@
         <w:pStyle w:val="6"/>
         <w:numPr>
           <w:ilvl w:val="0"/>
-          <w:numId w:val="7"/>
+          <w:numId w:val="8"/>
         </w:numPr>
         <w:tabs>
           <w:tab w:val="left" w:pos="741"/>
@@ -22610,7 +21061,7 @@
         <w:pStyle w:val="6"/>
         <w:numPr>
           <w:ilvl w:val="0"/>
-          <w:numId w:val="7"/>
+          <w:numId w:val="8"/>
         </w:numPr>
         <w:tabs>
           <w:tab w:val="left" w:pos="741"/>
@@ -22804,7 +21255,7 @@
         <w:pStyle w:val="6"/>
         <w:numPr>
           <w:ilvl w:val="0"/>
-          <w:numId w:val="7"/>
+          <w:numId w:val="8"/>
         </w:numPr>
         <w:tabs>
           <w:tab w:val="left" w:pos="741"/>
@@ -23353,7 +21804,7 @@
       <w:lvlText w:val="%1."/>
       <w:lvlJc w:val="left"/>
       <w:pPr>
-        <w:ind w:left="525" w:hanging="360"/>
+        <w:ind w:left="360" w:hanging="360"/>
         <w:jc w:val="left"/>
       </w:pPr>
       <w:rPr>
@@ -24007,6 +22458,137 @@
       </w:rPr>
     </w:lvl>
   </w:abstractNum>
+  <w:abstractNum w:abstractNumId="7">
+    <w:nsid w:val="62786A5A"/>
+    <w:multiLevelType w:val="multilevel"/>
+    <w:tmpl w:val="62786A5A"/>
+    <w:lvl w:ilvl="0" w:tentative="0">
+      <w:start w:val="1"/>
+      <w:numFmt w:val="decimal"/>
+      <w:lvlText w:val="%1."/>
+      <w:lvlJc w:val="left"/>
+      <w:pPr>
+        <w:ind w:left="525" w:hanging="360"/>
+      </w:pPr>
+      <w:rPr>
+        <w:rFonts w:hint="default" w:ascii="Calibri" w:hAnsi="Calibri" w:eastAsia="Calibri" w:cs="Calibri"/>
+        <w:b w:val="0"/>
+        <w:bCs w:val="0"/>
+        <w:i w:val="0"/>
+        <w:iCs w:val="0"/>
+        <w:spacing w:val="0"/>
+        <w:w w:val="100"/>
+        <w:sz w:val="22"/>
+        <w:szCs w:val="22"/>
+        <w:lang w:val="en-US" w:eastAsia="en-US" w:bidi="ar-SA"/>
+      </w:rPr>
+    </w:lvl>
+    <w:lvl w:ilvl="1" w:tentative="0">
+      <w:start w:val="1"/>
+      <w:numFmt w:val="decimal"/>
+      <w:lvlText w:val="%2."/>
+      <w:lvlJc w:val="left"/>
+      <w:pPr>
+        <w:ind w:left="1103" w:hanging="360"/>
+      </w:pPr>
+      <w:rPr>
+        <w:rFonts w:hint="default" w:ascii="Calibri" w:hAnsi="Calibri" w:eastAsia="Calibri" w:cs="Calibri"/>
+        <w:b w:val="0"/>
+        <w:bCs w:val="0"/>
+        <w:i w:val="0"/>
+        <w:iCs w:val="0"/>
+        <w:spacing w:val="0"/>
+        <w:w w:val="100"/>
+        <w:sz w:val="22"/>
+        <w:szCs w:val="22"/>
+        <w:lang w:val="en-US" w:eastAsia="en-US" w:bidi="ar-SA"/>
+      </w:rPr>
+    </w:lvl>
+    <w:lvl w:ilvl="2" w:tentative="0">
+      <w:start w:val="0"/>
+      <w:numFmt w:val="bullet"/>
+      <w:lvlText w:val="•"/>
+      <w:lvlJc w:val="left"/>
+      <w:pPr>
+        <w:ind w:left="1985" w:hanging="360"/>
+      </w:pPr>
+      <w:rPr>
+        <w:lang w:val="en-US" w:eastAsia="en-US" w:bidi="ar-SA"/>
+      </w:rPr>
+    </w:lvl>
+    <w:lvl w:ilvl="3" w:tentative="0">
+      <w:start w:val="0"/>
+      <w:numFmt w:val="bullet"/>
+      <w:lvlText w:val="•"/>
+      <w:lvlJc w:val="left"/>
+      <w:pPr>
+        <w:ind w:left="2871" w:hanging="360"/>
+      </w:pPr>
+      <w:rPr>
+        <w:lang w:val="en-US" w:eastAsia="en-US" w:bidi="ar-SA"/>
+      </w:rPr>
+    </w:lvl>
+    <w:lvl w:ilvl="4" w:tentative="0">
+      <w:start w:val="0"/>
+      <w:numFmt w:val="bullet"/>
+      <w:lvlText w:val="•"/>
+      <w:lvlJc w:val="left"/>
+      <w:pPr>
+        <w:ind w:left="3757" w:hanging="360"/>
+      </w:pPr>
+      <w:rPr>
+        <w:lang w:val="en-US" w:eastAsia="en-US" w:bidi="ar-SA"/>
+      </w:rPr>
+    </w:lvl>
+    <w:lvl w:ilvl="5" w:tentative="0">
+      <w:start w:val="0"/>
+      <w:numFmt w:val="bullet"/>
+      <w:lvlText w:val="•"/>
+      <w:lvlJc w:val="left"/>
+      <w:pPr>
+        <w:ind w:left="4643" w:hanging="360"/>
+      </w:pPr>
+      <w:rPr>
+        <w:lang w:val="en-US" w:eastAsia="en-US" w:bidi="ar-SA"/>
+      </w:rPr>
+    </w:lvl>
+    <w:lvl w:ilvl="6" w:tentative="0">
+      <w:start w:val="0"/>
+      <w:numFmt w:val="bullet"/>
+      <w:lvlText w:val="•"/>
+      <w:lvlJc w:val="left"/>
+      <w:pPr>
+        <w:ind w:left="5529" w:hanging="360"/>
+      </w:pPr>
+      <w:rPr>
+        <w:lang w:val="en-US" w:eastAsia="en-US" w:bidi="ar-SA"/>
+      </w:rPr>
+    </w:lvl>
+    <w:lvl w:ilvl="7" w:tentative="0">
+      <w:start w:val="0"/>
+      <w:numFmt w:val="bullet"/>
+      <w:lvlText w:val="•"/>
+      <w:lvlJc w:val="left"/>
+      <w:pPr>
+        <w:ind w:left="6414" w:hanging="360"/>
+      </w:pPr>
+      <w:rPr>
+        <w:lang w:val="en-US" w:eastAsia="en-US" w:bidi="ar-SA"/>
+      </w:rPr>
+    </w:lvl>
+    <w:lvl w:ilvl="8" w:tentative="0">
+      <w:start w:val="0"/>
+      <w:numFmt w:val="bullet"/>
+      <w:lvlText w:val="•"/>
+      <w:lvlJc w:val="left"/>
+      <w:pPr>
+        <w:ind w:left="7300" w:hanging="360"/>
+      </w:pPr>
+      <w:rPr>
+        <w:lang w:val="en-US" w:eastAsia="en-US" w:bidi="ar-SA"/>
+      </w:rPr>
+    </w:lvl>
+  </w:abstractNum>
   <w:num w:numId="1">
     <w:abstractNumId w:val="3"/>
   </w:num>
@@ -24014,18 +22596,27 @@
     <w:abstractNumId w:val="2"/>
   </w:num>
   <w:num w:numId="3">
+    <w:abstractNumId w:val="7"/>
+    <w:lvlOverride w:ilvl="0">
+      <w:startOverride w:val="1"/>
+    </w:lvlOverride>
+    <w:lvlOverride w:ilvl="1">
+      <w:startOverride w:val="1"/>
+    </w:lvlOverride>
+  </w:num>
+  <w:num w:numId="4">
     <w:abstractNumId w:val="6"/>
   </w:num>
-  <w:num w:numId="4">
+  <w:num w:numId="5">
     <w:abstractNumId w:val="1"/>
   </w:num>
-  <w:num w:numId="5">
+  <w:num w:numId="6">
     <w:abstractNumId w:val="0"/>
   </w:num>
-  <w:num w:numId="6">
+  <w:num w:numId="7">
     <w:abstractNumId w:val="4"/>
   </w:num>
-  <w:num w:numId="7">
+  <w:num w:numId="8">
     <w:abstractNumId w:val="5"/>
   </w:num>
 </w:numbering>
@@ -24145,7 +22736,7 @@
     <w:lsdException w:unhideWhenUsed="0" w:uiPriority="0" w:semiHidden="0" w:name="HTML Sample"/>
     <w:lsdException w:unhideWhenUsed="0" w:uiPriority="0" w:semiHidden="0" w:name="HTML Typewriter"/>
     <w:lsdException w:unhideWhenUsed="0" w:uiPriority="0" w:semiHidden="0" w:name="HTML Variable"/>
-    <w:lsdException w:unhideWhenUsed="0" w:uiPriority="0" w:name="Normal Table"/>
+    <w:lsdException w:qFormat="1" w:unhideWhenUsed="0" w:uiPriority="0" w:name="Normal Table"/>
     <w:lsdException w:unhideWhenUsed="0" w:uiPriority="0" w:semiHidden="0" w:name="annotation subject"/>
     <w:lsdException w:unhideWhenUsed="0" w:uiPriority="0" w:semiHidden="0" w:name="Table Simple 1"/>
     <w:lsdException w:unhideWhenUsed="0" w:uiPriority="0" w:semiHidden="0" w:name="Table Simple 2"/>
@@ -24321,6 +22912,7 @@
   <w:style w:type="table" w:default="1" w:styleId="3">
     <w:name w:val="Normal Table"/>
     <w:semiHidden/>
+    <w:qFormat/>
     <w:uiPriority w:val="0"/>
     <w:tblPr>
       <w:tblCellMar>

</xml_diff>